<commit_message>
update: modify resume document for content improvements
</commit_message>
<xml_diff>
--- a/resume/Pabolu_Manohar_Resume.docx
+++ b/resume/Pabolu_Manohar_Resume.docx
@@ -4,15 +4,21 @@
   <w:body>
     <w:p>
       <w:pPr>
+        <w:spacing w:after="24" w:before="0" w:line="240" w:lineRule="auto"/>
         <w:jc w:val="center"/>
-        <w:rPr/>
+        <w:rPr>
+          <w:sz w:val="20"/>
+          <w:szCs w:val="20"/>
+        </w:rPr>
       </w:pPr>
       <w:r>
         <w:rPr>
+          <w:rFonts w:ascii="Arial" w:cs="Arial" w:eastAsia="Arial" w:hAnsi="Arial"/>
           <w:b w:val="1"/>
           <w:bCs w:val="1"/>
-          <w:sz w:val="34"/>
-          <w:szCs w:val="34"/>
+          <w:color w:val="2e74b5"/>
+          <w:sz w:val="36"/>
+          <w:szCs w:val="36"/>
           <w:rtl w:val="0"/>
         </w:rPr>
         <w:t xml:space="preserve">PABOLU MANOHAR</w:t>
@@ -25,18 +31,24 @@
     </w:p>
     <w:p>
       <w:pPr>
+        <w:spacing w:after="30" w:before="0" w:line="240" w:lineRule="auto"/>
         <w:jc w:val="center"/>
-        <w:rPr/>
+        <w:rPr>
+          <w:sz w:val="20"/>
+          <w:szCs w:val="20"/>
+        </w:rPr>
       </w:pPr>
       <w:r>
         <w:rPr>
+          <w:rFonts w:ascii="Arial" w:cs="Arial" w:eastAsia="Arial" w:hAnsi="Arial"/>
           <w:b w:val="1"/>
           <w:bCs w:val="1"/>
-          <w:sz w:val="20"/>
-          <w:szCs w:val="20"/>
+          <w:color w:val="000000"/>
+          <w:sz w:val="21"/>
+          <w:szCs w:val="21"/>
           <w:rtl w:val="0"/>
         </w:rPr>
-        <w:t xml:space="preserve">Software Engineer · Backend &amp; Infrastructure · Agentic AI · Cloud &amp; Kubernetes</w:t>
+        <w:t xml:space="preserve">Software Engineer | Backend | Python | Cloud</w:t>
       </w:r>
       <w:r>
         <w:rPr>
@@ -46,27 +58,98 @@
     </w:p>
     <w:p>
       <w:pPr>
-        <w:spacing w:after="100" w:lineRule="auto"/>
+        <w:spacing w:after="40" w:line="240" w:lineRule="auto"/>
         <w:jc w:val="center"/>
-        <w:rPr/>
+        <w:rPr>
+          <w:sz w:val="20"/>
+          <w:szCs w:val="20"/>
+        </w:rPr>
       </w:pPr>
       <w:r>
         <w:rPr>
+          <w:rFonts w:ascii="Arial" w:cs="Arial" w:eastAsia="Arial" w:hAnsi="Arial"/>
+          <w:color w:val="000000"/>
           <w:rtl w:val="0"/>
         </w:rPr>
-        <w:t xml:space="preserve">pabolumanohar1@gmail.com  |  +91 7670978281  |  github.com/PaboluManohar  |  linkedin.com/in/pabolumanohar</w:t>
+        <w:t xml:space="preserve">pabolumanohar1@gmail.com | +91 7670978281 | </w:t>
+      </w:r>
+      <w:hyperlink r:id="rId7">
+        <w:r>
+          <w:rPr>
+            <w:color w:val="2e74b5"/>
+            <w:sz w:val="20"/>
+            <w:szCs w:val="20"/>
+            <w:u w:val="single"/>
+            <w:rtl w:val="0"/>
+          </w:rPr>
+          <w:t xml:space="preserve">Github</w:t>
+        </w:r>
+      </w:hyperlink>
+      <w:r>
+        <w:rPr>
+          <w:rFonts w:ascii="Arial" w:cs="Arial" w:eastAsia="Arial" w:hAnsi="Arial"/>
+          <w:color w:val="000000"/>
+          <w:rtl w:val="0"/>
+        </w:rPr>
+        <w:t xml:space="preserve"> | </w:t>
+      </w:r>
+      <w:hyperlink r:id="rId8">
+        <w:r>
+          <w:rPr>
+            <w:color w:val="2e74b5"/>
+            <w:sz w:val="20"/>
+            <w:szCs w:val="20"/>
+            <w:u w:val="single"/>
+            <w:rtl w:val="0"/>
+          </w:rPr>
+          <w:t xml:space="preserve">Linkedin</w:t>
+        </w:r>
+      </w:hyperlink>
+      <w:r>
+        <w:rPr>
+          <w:rFonts w:ascii="Arial" w:cs="Arial" w:eastAsia="Arial" w:hAnsi="Arial"/>
+          <w:color w:val="000000"/>
+          <w:rtl w:val="0"/>
+        </w:rPr>
+        <w:t xml:space="preserve"> | </w:t>
+      </w:r>
+      <w:hyperlink r:id="rId9">
+        <w:r>
+          <w:rPr>
+            <w:color w:val="2e74b5"/>
+            <w:sz w:val="20"/>
+            <w:szCs w:val="20"/>
+            <w:u w:val="single"/>
+            <w:rtl w:val="0"/>
+          </w:rPr>
+          <w:t xml:space="preserve">Portfolio</w:t>
+        </w:r>
+      </w:hyperlink>
+      <w:r>
+        <w:rPr>
+          <w:rtl w:val="0"/>
+        </w:rPr>
       </w:r>
     </w:p>
     <w:p>
       <w:pPr>
-        <w:spacing w:after="60" w:before="140" w:lineRule="auto"/>
-        <w:rPr>
-          <w:b w:val="1"/>
-          <w:bCs w:val="1"/>
-          <w:sz w:val="22"/>
-          <w:szCs w:val="22"/>
+        <w:spacing w:after="80" w:before="0" w:line="240" w:lineRule="auto"/>
+        <w:jc w:val="center"/>
+        <w:rPr>
+          <w:sz w:val="20"/>
+          <w:szCs w:val="20"/>
         </w:rPr>
       </w:pPr>
+      <w:r>
+        <w:rPr>
+          <w:rFonts w:ascii="Arial" w:cs="Arial" w:eastAsia="Arial" w:hAnsi="Arial"/>
+          <w:b w:val="0"/>
+          <w:bCs w:val="0"/>
+          <w:color w:val="000000"/>
+          <w:rtl w:val="0"/>
+        </w:rPr>
+        <w:t xml:space="preserve">Ongole, Andhra Pradesh, 523253</w:t>
+      </w:r>
       <w:r>
         <w:rPr>
           <w:rtl w:val="0"/>
@@ -75,19 +158,26 @@
     </w:p>
     <w:p>
       <w:pPr>
-        <w:spacing w:after="60" w:before="140" w:lineRule="auto"/>
-        <w:rPr/>
+        <w:pBdr>
+          <w:bottom w:color="a6a6a6" w:space="1" w:sz="4" w:val="single"/>
+        </w:pBdr>
+        <w:spacing w:after="32" w:before="80" w:line="240" w:lineRule="auto"/>
+        <w:rPr>
+          <w:sz w:val="20"/>
+          <w:szCs w:val="20"/>
+        </w:rPr>
       </w:pPr>
       <w:r>
         <w:rPr>
           <w:rFonts w:ascii="Arial" w:cs="Arial" w:eastAsia="Arial" w:hAnsi="Arial"/>
           <w:b w:val="1"/>
           <w:bCs w:val="1"/>
-          <w:sz w:val="22"/>
-          <w:szCs w:val="22"/>
+          <w:color w:val="000000"/>
+          <w:sz w:val="20"/>
+          <w:szCs w:val="20"/>
           <w:rtl w:val="0"/>
         </w:rPr>
-        <w:t xml:space="preserve">PROFESSIONAL SUMMARY</w:t>
+        <w:t xml:space="preserve">Professional Summary</w:t>
       </w:r>
       <w:r>
         <w:rPr>
@@ -97,20 +187,21 @@
     </w:p>
     <w:p>
       <w:pPr>
-        <w:spacing w:after="60" w:lineRule="auto"/>
-        <w:jc w:val="both"/>
-        <w:rPr>
-          <w:b w:val="1"/>
-          <w:bCs w:val="1"/>
-          <w:sz w:val="22"/>
-          <w:szCs w:val="22"/>
+        <w:spacing w:after="20" w:before="0" w:line="240" w:lineRule="auto"/>
+        <w:rPr>
+          <w:sz w:val="20"/>
+          <w:szCs w:val="20"/>
         </w:rPr>
       </w:pPr>
       <w:r>
         <w:rPr>
+          <w:rFonts w:ascii="Arial" w:cs="Arial" w:eastAsia="Arial" w:hAnsi="Arial"/>
+          <w:b w:val="0"/>
+          <w:bCs w:val="0"/>
+          <w:color w:val="000000"/>
           <w:rtl w:val="0"/>
         </w:rPr>
-        <w:t xml:space="preserve">Software Engineer with experience in Python, FastAPI, backend systems, Agentic AI, and cloud infrastructure. Production experience with Kubernetes, GCP, microservices, and distributed systems. Hands-on experience building multi-agent workflows using LangChain, LangGraph, MCP, LiteLLM, and Langfuse. Experienced in designing, developing, and deploying scalable production systems from architecture to implementation.</w:t>
+        <w:t xml:space="preserve">Software Engineer with 2+ years of experience building backend services, distributed automation platforms and cloud-native systems. Strong in Python, FastAPI, REST APIs, microservices, Kubernetes and cloud infrastructure, with hands-on experience in Agentic AI workflows, asynchronous processing, observability and production systems.</w:t>
       </w:r>
       <w:r>
         <w:rPr>
@@ -120,19 +211,26 @@
     </w:p>
     <w:p>
       <w:pPr>
-        <w:spacing w:after="60" w:before="220" w:line="276" w:lineRule="auto"/>
-        <w:rPr/>
+        <w:pBdr>
+          <w:bottom w:color="a6a6a6" w:space="1" w:sz="4" w:val="single"/>
+        </w:pBdr>
+        <w:spacing w:after="32" w:before="220" w:line="240" w:lineRule="auto"/>
+        <w:rPr>
+          <w:sz w:val="20"/>
+          <w:szCs w:val="20"/>
+        </w:rPr>
       </w:pPr>
       <w:r>
         <w:rPr>
           <w:rFonts w:ascii="Arial" w:cs="Arial" w:eastAsia="Arial" w:hAnsi="Arial"/>
           <w:b w:val="1"/>
           <w:bCs w:val="1"/>
-          <w:sz w:val="22"/>
-          <w:szCs w:val="22"/>
+          <w:color w:val="000000"/>
+          <w:sz w:val="20"/>
+          <w:szCs w:val="20"/>
           <w:rtl w:val="0"/>
         </w:rPr>
-        <w:t xml:space="preserve">TECHNICAL SKILLS</w:t>
+        <w:t xml:space="preserve">Technical Skills</w:t>
       </w:r>
       <w:r>
         <w:rPr>
@@ -142,189 +240,281 @@
     </w:p>
     <w:p>
       <w:pPr>
-        <w:spacing w:after="30" w:lineRule="auto"/>
-        <w:rPr/>
+        <w:spacing w:after="9" w:before="40" w:line="240" w:lineRule="auto"/>
+        <w:rPr>
+          <w:sz w:val="20"/>
+          <w:szCs w:val="20"/>
+        </w:rPr>
       </w:pPr>
       <w:r>
         <w:rPr>
+          <w:rFonts w:ascii="Arial" w:cs="Arial" w:eastAsia="Arial" w:hAnsi="Arial"/>
           <w:b w:val="1"/>
           <w:bCs w:val="1"/>
+          <w:color w:val="000000"/>
           <w:rtl w:val="0"/>
         </w:rPr>
         <w:t xml:space="preserve">Languages: </w:t>
       </w:r>
       <w:r>
         <w:rPr>
+          <w:rFonts w:ascii="Arial" w:cs="Arial" w:eastAsia="Arial" w:hAnsi="Arial"/>
+          <w:color w:val="000000"/>
           <w:rtl w:val="0"/>
         </w:rPr>
-        <w:t xml:space="preserve">Python, Java , Go (learning)</w:t>
+        <w:t xml:space="preserve">Python, Java, Go, SQL, JavaScript, TypeScript</w:t>
+      </w:r>
+      <w:r>
+        <w:rPr>
+          <w:rtl w:val="0"/>
+        </w:rPr>
       </w:r>
     </w:p>
     <w:p>
       <w:pPr>
-        <w:spacing w:after="30" w:lineRule="auto"/>
-        <w:rPr/>
+        <w:spacing w:after="9" w:before="40" w:line="240" w:lineRule="auto"/>
+        <w:rPr>
+          <w:sz w:val="20"/>
+          <w:szCs w:val="20"/>
+        </w:rPr>
       </w:pPr>
       <w:r>
         <w:rPr>
+          <w:rFonts w:ascii="Arial" w:cs="Arial" w:eastAsia="Arial" w:hAnsi="Arial"/>
           <w:b w:val="1"/>
           <w:bCs w:val="1"/>
+          <w:color w:val="000000"/>
           <w:rtl w:val="0"/>
         </w:rPr>
         <w:t xml:space="preserve">Backend: </w:t>
       </w:r>
       <w:r>
         <w:rPr>
+          <w:rFonts w:ascii="Arial" w:cs="Arial" w:eastAsia="Arial" w:hAnsi="Arial"/>
+          <w:color w:val="000000"/>
           <w:rtl w:val="0"/>
         </w:rPr>
-        <w:t xml:space="preserve">FastAPI, REST APIs, Microservices, SpringBoot, Stripe SDK, Dapr SDK [Distributed Application Runtime]-CNCF </w:t>
+        <w:t xml:space="preserve">FastAPI, REST APIs, AsyncIO, Microservices, Pydantic, Spring Boot, Dapr SDK, Stripe SDK</w:t>
+      </w:r>
+      <w:r>
+        <w:rPr>
+          <w:rtl w:val="0"/>
+        </w:rPr>
       </w:r>
     </w:p>
     <w:p>
       <w:pPr>
-        <w:spacing w:after="30" w:lineRule="auto"/>
-        <w:rPr/>
+        <w:spacing w:after="9" w:before="40" w:line="240" w:lineRule="auto"/>
+        <w:rPr>
+          <w:sz w:val="20"/>
+          <w:szCs w:val="20"/>
+        </w:rPr>
       </w:pPr>
       <w:r>
         <w:rPr>
+          <w:rFonts w:ascii="Arial" w:cs="Arial" w:eastAsia="Arial" w:hAnsi="Arial"/>
           <w:b w:val="1"/>
           <w:bCs w:val="1"/>
+          <w:color w:val="000000"/>
           <w:rtl w:val="0"/>
         </w:rPr>
-        <w:t xml:space="preserve">Agentic AI &amp; LLM: </w:t>
+        <w:t xml:space="preserve">Distributed Systems: </w:t>
       </w:r>
       <w:r>
         <w:rPr>
+          <w:rFonts w:ascii="Arial" w:cs="Arial" w:eastAsia="Arial" w:hAnsi="Arial"/>
+          <w:color w:val="000000"/>
           <w:rtl w:val="0"/>
         </w:rPr>
-        <w:t xml:space="preserve">Agentic AI, Agentic Workflows, Multi-Agent Systems, Agent Orchestration, LangChain, LangGraph, Model Context Protocol (MCP), LiteLLM, Langfuse, LLM Observability</w:t>
+        <w:t xml:space="preserve">Queues, Workers, Pub/Sub, Service Invocation, Resource Allocation, Concurrent Workloads</w:t>
+      </w:r>
+      <w:r>
+        <w:rPr>
+          <w:rtl w:val="0"/>
+        </w:rPr>
       </w:r>
     </w:p>
     <w:p>
       <w:pPr>
-        <w:spacing w:after="30" w:lineRule="auto"/>
-        <w:rPr/>
+        <w:spacing w:after="9" w:before="40" w:line="240" w:lineRule="auto"/>
+        <w:rPr>
+          <w:sz w:val="20"/>
+          <w:szCs w:val="20"/>
+        </w:rPr>
       </w:pPr>
       <w:r>
         <w:rPr>
+          <w:rFonts w:ascii="Arial" w:cs="Arial" w:eastAsia="Arial" w:hAnsi="Arial"/>
           <w:b w:val="1"/>
           <w:bCs w:val="1"/>
+          <w:color w:val="000000"/>
           <w:rtl w:val="0"/>
         </w:rPr>
-        <w:t xml:space="preserve">Infrastructure: </w:t>
+        <w:t xml:space="preserve">Cloud &amp; Infrastructure: </w:t>
       </w:r>
       <w:r>
         <w:rPr>
+          <w:rFonts w:ascii="Arial" w:cs="Arial" w:eastAsia="Arial" w:hAnsi="Arial"/>
+          <w:color w:val="000000"/>
           <w:rtl w:val="0"/>
         </w:rPr>
-        <w:t xml:space="preserve">Kubernetes (GKE), Docker, Helm, GCP, AWS, Linux, VPN , Networking</w:t>
+        <w:t xml:space="preserve">Kubernetes (GKE), Docker, Helm, GCP, AWS, Terraform, Linux, Networking</w:t>
+      </w:r>
+      <w:r>
+        <w:rPr>
+          <w:rtl w:val="0"/>
+        </w:rPr>
       </w:r>
     </w:p>
     <w:p>
       <w:pPr>
-        <w:spacing w:after="30" w:lineRule="auto"/>
-        <w:rPr/>
+        <w:spacing w:after="9" w:before="40" w:line="240" w:lineRule="auto"/>
+        <w:rPr>
+          <w:sz w:val="20"/>
+          <w:szCs w:val="20"/>
+        </w:rPr>
       </w:pPr>
       <w:r>
         <w:rPr>
+          <w:rFonts w:ascii="Arial" w:cs="Arial" w:eastAsia="Arial" w:hAnsi="Arial"/>
           <w:b w:val="1"/>
           <w:bCs w:val="1"/>
+          <w:color w:val="000000"/>
           <w:rtl w:val="0"/>
         </w:rPr>
-        <w:t xml:space="preserve">Observability: </w:t>
+        <w:t xml:space="preserve">Databases &amp; Messaging: </w:t>
       </w:r>
       <w:r>
         <w:rPr>
+          <w:rFonts w:ascii="Arial" w:cs="Arial" w:eastAsia="Arial" w:hAnsi="Arial"/>
+          <w:color w:val="000000"/>
           <w:rtl w:val="0"/>
         </w:rPr>
-        <w:t xml:space="preserve">Prometheus, Grafana, Node Exporter, cAdvisor, Elasticsearch, Kibana</w:t>
+        <w:t xml:space="preserve">PostgreSQL, Redis, Elasticsearch, Kafka, Azure Service Bus</w:t>
+      </w:r>
+      <w:r>
+        <w:rPr>
+          <w:rtl w:val="0"/>
+        </w:rPr>
       </w:r>
     </w:p>
     <w:p>
       <w:pPr>
-        <w:spacing w:after="30" w:lineRule="auto"/>
-        <w:rPr/>
+        <w:spacing w:after="9" w:before="40" w:line="240" w:lineRule="auto"/>
+        <w:rPr>
+          <w:sz w:val="20"/>
+          <w:szCs w:val="20"/>
+        </w:rPr>
       </w:pPr>
       <w:r>
         <w:rPr>
+          <w:rFonts w:ascii="Arial" w:cs="Arial" w:eastAsia="Arial" w:hAnsi="Arial"/>
           <w:b w:val="1"/>
           <w:bCs w:val="1"/>
+          <w:color w:val="000000"/>
           <w:rtl w:val="0"/>
         </w:rPr>
-        <w:t xml:space="preserve">DevOps &amp; CI/CD: </w:t>
+        <w:t xml:space="preserve">Observability: </w:t>
       </w:r>
       <w:r>
         <w:rPr>
+          <w:rFonts w:ascii="Arial" w:cs="Arial" w:eastAsia="Arial" w:hAnsi="Arial"/>
+          <w:color w:val="000000"/>
           <w:rtl w:val="0"/>
         </w:rPr>
-        <w:t xml:space="preserve">Git, Jenkins, GitHub Actions, Kong API Gateway (OSS), Nginx, Redis Pub/Sub Stream</w:t>
+        <w:t xml:space="preserve">Prometheus, Grafana, Node Exporter, cAdvisor, Elasticsearch, Kibana</w:t>
+      </w:r>
+      <w:r>
+        <w:rPr>
+          <w:rtl w:val="0"/>
+        </w:rPr>
       </w:r>
     </w:p>
     <w:p>
       <w:pPr>
-        <w:spacing w:after="30" w:lineRule="auto"/>
-        <w:rPr/>
+        <w:spacing w:after="9" w:before="40" w:line="240" w:lineRule="auto"/>
+        <w:rPr>
+          <w:sz w:val="20"/>
+          <w:szCs w:val="20"/>
+        </w:rPr>
       </w:pPr>
       <w:r>
         <w:rPr>
+          <w:rFonts w:ascii="Arial" w:cs="Arial" w:eastAsia="Arial" w:hAnsi="Arial"/>
           <w:b w:val="1"/>
           <w:bCs w:val="1"/>
+          <w:color w:val="000000"/>
           <w:rtl w:val="0"/>
         </w:rPr>
-        <w:t xml:space="preserve">Protocols &amp; Systems: </w:t>
+        <w:t xml:space="preserve">AI &amp; Automation: </w:t>
       </w:r>
       <w:r>
         <w:rPr>
+          <w:rFonts w:ascii="Arial" w:cs="Arial" w:eastAsia="Arial" w:hAnsi="Arial"/>
+          <w:color w:val="000000"/>
           <w:rtl w:val="0"/>
         </w:rPr>
-        <w:t xml:space="preserve">ADB, USB-over-TCP, WebSockets, WebRTC (STUN/TURN), Appium, TCP/IP</w:t>
+        <w:t xml:space="preserve">Agentic AI, LangChain, LangGraph, MCP, LiteLLM, Langfuse, Appium, Selenium, Cypress, Playwright</w:t>
+      </w:r>
+      <w:r>
+        <w:rPr>
+          <w:rtl w:val="0"/>
+        </w:rPr>
       </w:r>
     </w:p>
     <w:p>
       <w:pPr>
-        <w:spacing w:after="30" w:lineRule="auto"/>
-        <w:rPr>
+        <w:spacing w:after="9" w:before="40" w:line="240" w:lineRule="auto"/>
+        <w:rPr>
+          <w:rFonts w:ascii="Arial" w:cs="Arial" w:eastAsia="Arial" w:hAnsi="Arial"/>
+          <w:color w:val="000000"/>
+        </w:rPr>
+      </w:pPr>
+      <w:r>
+        <w:rPr>
+          <w:rFonts w:ascii="Arial" w:cs="Arial" w:eastAsia="Arial" w:hAnsi="Arial"/>
           <w:b w:val="1"/>
           <w:bCs w:val="1"/>
-          <w:sz w:val="22"/>
-          <w:szCs w:val="22"/>
-        </w:rPr>
-      </w:pPr>
-      <w:r>
-        <w:rPr>
-          <w:b w:val="1"/>
-          <w:bCs w:val="1"/>
+          <w:color w:val="000000"/>
           <w:rtl w:val="0"/>
         </w:rPr>
-        <w:t xml:space="preserve">Databases &amp; Messaging: </w:t>
+        <w:t xml:space="preserve">DevOps &amp; Systems: </w:t>
       </w:r>
       <w:r>
         <w:rPr>
+          <w:rFonts w:ascii="Arial" w:cs="Arial" w:eastAsia="Arial" w:hAnsi="Arial"/>
+          <w:color w:val="000000"/>
           <w:rtl w:val="0"/>
         </w:rPr>
-        <w:t xml:space="preserve">Postgres , Redis, Elasticsearch, Kafka , Azure bus</w:t>
-      </w:r>
-      <w:r>
-        <w:rPr>
-          <w:rtl w:val="0"/>
-        </w:rPr>
+        <w:t xml:space="preserve">Git, Jenkins, GitHub Actions, Kong API Gateway (OSS), Nginx, ADB, WebSockets, TCP/IP</w:t>
       </w:r>
     </w:p>
     <w:p>
       <w:pPr>
-        <w:spacing w:after="60" w:before="220" w:line="276" w:lineRule="auto"/>
+        <w:pBdr>
+          <w:top w:color="000000" w:space="0" w:sz="0" w:val="none"/>
+          <w:left w:color="000000" w:space="0" w:sz="0" w:val="none"/>
+          <w:bottom w:color="000000" w:space="0" w:sz="0" w:val="none"/>
+          <w:right w:color="000000" w:space="0" w:sz="0" w:val="none"/>
+          <w:between w:color="000000" w:space="0" w:sz="0" w:val="none"/>
+        </w:pBdr>
+        <w:shd w:fill="ffffff" w:val="clear"/>
+        <w:spacing w:after="0" w:before="20" w:line="240" w:lineRule="auto"/>
         <w:rPr/>
       </w:pPr>
       <w:r>
         <w:rPr>
-          <w:rFonts w:ascii="Arial" w:cs="Arial" w:eastAsia="Arial" w:hAnsi="Arial"/>
           <w:b w:val="1"/>
           <w:bCs w:val="1"/>
-          <w:sz w:val="22"/>
-          <w:szCs w:val="22"/>
           <w:rtl w:val="0"/>
         </w:rPr>
-        <w:t xml:space="preserve">WORK EXPERIENCE</w:t>
+        <w:t xml:space="preserve">Other : </w:t>
+      </w:r>
+      <w:r>
+        <w:rPr>
+          <w:rtl w:val="0"/>
+        </w:rPr>
+        <w:t xml:space="preserve">Distributed-Systems , Scalability , Algorithms , Creativity , Problem Solving</w:t>
       </w:r>
       <w:r>
         <w:rPr>
@@ -334,25 +524,26 @@
     </w:p>
     <w:p>
       <w:pPr>
-        <w:rPr/>
+        <w:pBdr>
+          <w:bottom w:color="a6a6a6" w:space="1" w:sz="4" w:val="single"/>
+        </w:pBdr>
+        <w:spacing w:after="32" w:before="220" w:line="240" w:lineRule="auto"/>
+        <w:rPr>
+          <w:sz w:val="20"/>
+          <w:szCs w:val="20"/>
+        </w:rPr>
       </w:pPr>
       <w:r>
         <w:rPr>
+          <w:rFonts w:ascii="Arial" w:cs="Arial" w:eastAsia="Arial" w:hAnsi="Arial"/>
           <w:b w:val="1"/>
           <w:bCs w:val="1"/>
-          <w:sz w:val="21"/>
-          <w:szCs w:val="21"/>
+          <w:color w:val="000000"/>
+          <w:sz w:val="20"/>
+          <w:szCs w:val="20"/>
           <w:rtl w:val="0"/>
         </w:rPr>
-        <w:t xml:space="preserve">Software Engineer (Full-Time) | FlintLab</w:t>
-      </w:r>
-      <w:r>
-        <w:rPr>
-          <w:i w:val="1"/>
-          <w:iCs w:val="1"/>
-          <w:rtl w:val="0"/>
-        </w:rPr>
-        <w:t xml:space="preserve">    Mar 2025 – Present · Visakhapatnam</w:t>
+        <w:t xml:space="preserve">Work History</w:t>
       </w:r>
       <w:r>
         <w:rPr>
@@ -362,28 +553,47 @@
     </w:p>
     <w:p>
       <w:pPr>
-        <w:spacing w:after="60" w:lineRule="auto"/>
+        <w:spacing w:after="4" w:before="0" w:line="240" w:lineRule="auto"/>
+        <w:rPr>
+          <w:sz w:val="20"/>
+          <w:szCs w:val="20"/>
+        </w:rPr>
+      </w:pPr>
+      <w:r>
+        <w:rPr>
+          <w:rFonts w:ascii="Arial" w:cs="Arial" w:eastAsia="Arial" w:hAnsi="Arial"/>
+          <w:b w:val="1"/>
+          <w:bCs w:val="1"/>
+          <w:color w:val="000000"/>
+          <w:sz w:val="20"/>
+          <w:szCs w:val="20"/>
+          <w:rtl w:val="0"/>
+        </w:rPr>
+        <w:t xml:space="preserve">FlintLab — Software Engineer | Visakhapatnam, Andhra Pradesh</w:t>
+      </w:r>
+      <w:r>
+        <w:rPr>
+          <w:rtl w:val="0"/>
+        </w:rPr>
+      </w:r>
+    </w:p>
+    <w:p>
+      <w:pPr>
+        <w:spacing w:after="22" w:before="0" w:line="240" w:lineRule="auto"/>
+        <w:rPr>
+          <w:sz w:val="20"/>
+          <w:szCs w:val="20"/>
+        </w:rPr>
+      </w:pPr>
+      <w:r>
         <w:rPr>
           <w:rFonts w:ascii="Arial" w:cs="Arial" w:eastAsia="Arial" w:hAnsi="Arial"/>
           <w:b w:val="0"/>
           <w:bCs w:val="0"/>
-          <w:i w:val="0"/>
-          <w:iCs w:val="0"/>
-          <w:smallCaps w:val="0"/>
-          <w:strike w:val="0"/>
           <w:color w:val="000000"/>
-          <w:sz w:val="19"/>
-          <w:szCs w:val="19"/>
-          <w:u w:val="none"/>
-          <w:shd w:fill="auto" w:val="clear"/>
-          <w:vertAlign w:val="baseline"/>
-        </w:rPr>
-      </w:pPr>
-      <w:r>
-        <w:rPr>
           <w:rtl w:val="0"/>
         </w:rPr>
-        <w:t xml:space="preserve">FlintLab is a Seattle-based SaaS company providing real Android devices, emulators, and simulators for comprehensive cross-device testing.</w:t>
+        <w:t xml:space="preserve">September 2024 – Present</w:t>
       </w:r>
       <w:r>
         <w:rPr>
@@ -399,7 +609,7 @@
         <w:widowControl w:val="1"/>
         <w:numPr>
           <w:ilvl w:val="0"/>
-          <w:numId w:val="1"/>
+          <w:numId w:val="2"/>
         </w:numPr>
         <w:pBdr>
           <w:top w:space="0" w:sz="0" w:val="nil"/>
@@ -409,10 +619,20 @@
           <w:between w:space="0" w:sz="0" w:val="nil"/>
         </w:pBdr>
         <w:shd w:fill="auto" w:val="clear"/>
-        <w:spacing w:after="0" w:before="0" w:line="276" w:lineRule="auto"/>
-        <w:ind w:left="259" w:right="0" w:hanging="173"/>
+        <w:spacing w:after="0" w:before="60" w:line="240" w:lineRule="auto"/>
+        <w:ind w:left="720" w:right="0" w:hanging="360"/>
         <w:jc w:val="left"/>
-        <w:rPr/>
+        <w:rPr>
+          <w:rFonts w:ascii="Arial" w:cs="Arial" w:eastAsia="Arial" w:hAnsi="Arial"/>
+          <w:i w:val="0"/>
+          <w:iCs w:val="0"/>
+          <w:smallCaps w:val="0"/>
+          <w:strike w:val="0"/>
+          <w:color w:val="000000"/>
+          <w:u w:val="none"/>
+          <w:shd w:fill="auto" w:val="clear"/>
+          <w:vertAlign w:val="baseline"/>
+        </w:rPr>
       </w:pPr>
       <w:r>
         <w:rPr>
@@ -424,14 +644,85 @@
           <w:smallCaps w:val="0"/>
           <w:strike w:val="0"/>
           <w:color w:val="000000"/>
-          <w:sz w:val="19"/>
-          <w:szCs w:val="19"/>
           <w:u w:val="none"/>
           <w:shd w:fill="auto" w:val="clear"/>
           <w:vertAlign w:val="baseline"/>
           <w:rtl w:val="0"/>
         </w:rPr>
-        <w:t xml:space="preserve">Engineered a Billing System using Stripe and Redis Pub/Sub; abstracted usage tracking into a shared npm package consumed by all microservices, enabling automatic per-minute metering across the platform.</w:t>
+        <w:t xml:space="preserve">Built Python/FastAPI backend services for Nexus, supporting </w:t>
+      </w:r>
+      <w:r>
+        <w:rPr>
+          <w:rFonts w:ascii="Arial" w:cs="Arial" w:eastAsia="Arial" w:hAnsi="Arial"/>
+          <w:b w:val="1"/>
+          <w:bCs w:val="1"/>
+          <w:i w:val="0"/>
+          <w:iCs w:val="0"/>
+          <w:smallCaps w:val="0"/>
+          <w:strike w:val="0"/>
+          <w:color w:val="000000"/>
+          <w:u w:val="none"/>
+          <w:shd w:fill="auto" w:val="clear"/>
+          <w:vertAlign w:val="baseline"/>
+          <w:rtl w:val="0"/>
+        </w:rPr>
+        <w:t xml:space="preserve">500+ daily</w:t>
+      </w:r>
+      <w:r>
+        <w:rPr>
+          <w:rFonts w:ascii="Arial" w:cs="Arial" w:eastAsia="Arial" w:hAnsi="Arial"/>
+          <w:b w:val="0"/>
+          <w:bCs w:val="0"/>
+          <w:i w:val="0"/>
+          <w:iCs w:val="0"/>
+          <w:smallCaps w:val="0"/>
+          <w:strike w:val="0"/>
+          <w:color w:val="000000"/>
+          <w:u w:val="none"/>
+          <w:shd w:fill="auto" w:val="clear"/>
+          <w:vertAlign w:val="baseline"/>
+          <w:rtl w:val="0"/>
+        </w:rPr>
+        <w:t xml:space="preserve"> automated test workloads across Android, iOS and web environments; designed asynchronous API, queue and worker workflows that improved throughput by 40% while supporting </w:t>
+      </w:r>
+      <w:r>
+        <w:rPr>
+          <w:rFonts w:ascii="Arial" w:cs="Arial" w:eastAsia="Arial" w:hAnsi="Arial"/>
+          <w:b w:val="1"/>
+          <w:bCs w:val="1"/>
+          <w:i w:val="0"/>
+          <w:iCs w:val="0"/>
+          <w:smallCaps w:val="0"/>
+          <w:strike w:val="0"/>
+          <w:color w:val="000000"/>
+          <w:u w:val="none"/>
+          <w:shd w:fill="auto" w:val="clear"/>
+          <w:vertAlign w:val="baseline"/>
+          <w:rtl w:val="0"/>
+        </w:rPr>
+        <w:t xml:space="preserve">50+ concurrent jobs</w:t>
+      </w:r>
+      <w:r>
+        <w:rPr>
+          <w:rFonts w:ascii="Arial" w:cs="Arial" w:eastAsia="Arial" w:hAnsi="Arial"/>
+          <w:b w:val="0"/>
+          <w:bCs w:val="0"/>
+          <w:i w:val="0"/>
+          <w:iCs w:val="0"/>
+          <w:smallCaps w:val="0"/>
+          <w:strike w:val="0"/>
+          <w:color w:val="000000"/>
+          <w:u w:val="none"/>
+          <w:shd w:fill="auto" w:val="clear"/>
+          <w:vertAlign w:val="baseline"/>
+          <w:rtl w:val="0"/>
+        </w:rPr>
+        <w:t xml:space="preserve">.</w:t>
+      </w:r>
+      <w:r>
+        <w:rPr>
+          <w:rtl w:val="0"/>
+        </w:rPr>
       </w:r>
     </w:p>
     <w:p>
@@ -442,7 +733,7 @@
         <w:widowControl w:val="1"/>
         <w:numPr>
           <w:ilvl w:val="0"/>
-          <w:numId w:val="1"/>
+          <w:numId w:val="2"/>
         </w:numPr>
         <w:pBdr>
           <w:top w:space="0" w:sz="0" w:val="nil"/>
@@ -452,10 +743,20 @@
           <w:between w:space="0" w:sz="0" w:val="nil"/>
         </w:pBdr>
         <w:shd w:fill="auto" w:val="clear"/>
-        <w:spacing w:after="0" w:before="0" w:line="276" w:lineRule="auto"/>
-        <w:ind w:left="259" w:right="0" w:hanging="173"/>
+        <w:spacing w:after="0" w:before="60" w:line="240" w:lineRule="auto"/>
+        <w:ind w:left="720" w:right="0" w:hanging="360"/>
         <w:jc w:val="left"/>
-        <w:rPr/>
+        <w:rPr>
+          <w:rFonts w:ascii="Arial" w:cs="Arial" w:eastAsia="Arial" w:hAnsi="Arial"/>
+          <w:i w:val="0"/>
+          <w:iCs w:val="0"/>
+          <w:smallCaps w:val="0"/>
+          <w:strike w:val="0"/>
+          <w:color w:val="000000"/>
+          <w:u w:val="none"/>
+          <w:shd w:fill="auto" w:val="clear"/>
+          <w:vertAlign w:val="baseline"/>
+        </w:rPr>
       </w:pPr>
       <w:r>
         <w:rPr>
@@ -467,14 +768,51 @@
           <w:smallCaps w:val="0"/>
           <w:strike w:val="0"/>
           <w:color w:val="000000"/>
-          <w:sz w:val="19"/>
-          <w:szCs w:val="19"/>
           <w:u w:val="none"/>
           <w:shd w:fill="auto" w:val="clear"/>
           <w:vertAlign w:val="baseline"/>
           <w:rtl w:val="0"/>
         </w:rPr>
-        <w:t xml:space="preserve">Built a full Observability Stack: Prometheus + Grafana dashboards, cAdvisor, Node Exporter, and Elasticsearch/Kibana for log aggregation — reducing mean time to detect production issues significantly.</w:t>
+        <w:t xml:space="preserve">Developed device provisioning, allocation and health-monitoring workflows for </w:t>
+      </w:r>
+      <w:r>
+        <w:rPr>
+          <w:rFonts w:ascii="Arial" w:cs="Arial" w:eastAsia="Arial" w:hAnsi="Arial"/>
+          <w:b w:val="1"/>
+          <w:bCs w:val="1"/>
+          <w:i w:val="0"/>
+          <w:iCs w:val="0"/>
+          <w:smallCaps w:val="0"/>
+          <w:strike w:val="0"/>
+          <w:color w:val="000000"/>
+          <w:u w:val="none"/>
+          <w:shd w:fill="auto" w:val="clear"/>
+          <w:vertAlign w:val="baseline"/>
+          <w:rtl w:val="0"/>
+        </w:rPr>
+        <w:t xml:space="preserve">100+ distributed devices</w:t>
+      </w:r>
+      <w:r>
+        <w:rPr>
+          <w:rFonts w:ascii="Arial" w:cs="Arial" w:eastAsia="Arial" w:hAnsi="Arial"/>
+          <w:b w:val="0"/>
+          <w:bCs w:val="0"/>
+          <w:i w:val="0"/>
+          <w:iCs w:val="0"/>
+          <w:smallCaps w:val="0"/>
+          <w:strike w:val="0"/>
+          <w:color w:val="000000"/>
+          <w:u w:val="none"/>
+          <w:shd w:fill="auto" w:val="clear"/>
+          <w:vertAlign w:val="baseline"/>
+          <w:rtl w:val="0"/>
+        </w:rPr>
+        <w:t xml:space="preserve">, improving successful device allocation by 25%; integrated Kubernetes resource allocation with Prometheus, Grafana and Elasticsearch/Kibana to reduce production issue-detection time by 40%.</w:t>
+      </w:r>
+      <w:r>
+        <w:rPr>
+          <w:rtl w:val="0"/>
+        </w:rPr>
       </w:r>
     </w:p>
     <w:p>
@@ -485,7 +823,7 @@
         <w:widowControl w:val="1"/>
         <w:numPr>
           <w:ilvl w:val="0"/>
-          <w:numId w:val="1"/>
+          <w:numId w:val="2"/>
         </w:numPr>
         <w:pBdr>
           <w:top w:space="0" w:sz="0" w:val="nil"/>
@@ -495,10 +833,20 @@
           <w:between w:space="0" w:sz="0" w:val="nil"/>
         </w:pBdr>
         <w:shd w:fill="auto" w:val="clear"/>
-        <w:spacing w:after="0" w:before="0" w:line="276" w:lineRule="auto"/>
-        <w:ind w:left="259" w:right="0" w:hanging="173"/>
+        <w:spacing w:after="0" w:before="60" w:line="240" w:lineRule="auto"/>
+        <w:ind w:left="720" w:right="0" w:hanging="360"/>
         <w:jc w:val="left"/>
-        <w:rPr/>
+        <w:rPr>
+          <w:rFonts w:ascii="Arial" w:cs="Arial" w:eastAsia="Arial" w:hAnsi="Arial"/>
+          <w:i w:val="0"/>
+          <w:iCs w:val="0"/>
+          <w:smallCaps w:val="0"/>
+          <w:strike w:val="0"/>
+          <w:color w:val="000000"/>
+          <w:u w:val="none"/>
+          <w:shd w:fill="auto" w:val="clear"/>
+          <w:vertAlign w:val="baseline"/>
+        </w:rPr>
       </w:pPr>
       <w:r>
         <w:rPr>
@@ -510,14 +858,85 @@
           <w:smallCaps w:val="0"/>
           <w:strike w:val="0"/>
           <w:color w:val="000000"/>
-          <w:sz w:val="19"/>
-          <w:szCs w:val="19"/>
           <w:u w:val="none"/>
           <w:shd w:fill="auto" w:val="clear"/>
           <w:vertAlign w:val="baseline"/>
           <w:rtl w:val="0"/>
         </w:rPr>
-        <w:t xml:space="preserve">Deployed an OSS API Gateway to centralize routing, authentication, and request transformation across all microservices, eliminating the anti-pattern of exposing raw ports on routers.</w:t>
+        <w:t xml:space="preserve">Delivered FlintAPI, a public device-access REST API, end-to-end in </w:t>
+      </w:r>
+      <w:r>
+        <w:rPr>
+          <w:rFonts w:ascii="Arial" w:cs="Arial" w:eastAsia="Arial" w:hAnsi="Arial"/>
+          <w:b w:val="1"/>
+          <w:bCs w:val="1"/>
+          <w:i w:val="0"/>
+          <w:iCs w:val="0"/>
+          <w:smallCaps w:val="0"/>
+          <w:strike w:val="0"/>
+          <w:color w:val="000000"/>
+          <w:u w:val="none"/>
+          <w:shd w:fill="auto" w:val="clear"/>
+          <w:vertAlign w:val="baseline"/>
+          <w:rtl w:val="0"/>
+        </w:rPr>
+        <w:t xml:space="preserve">1 week</w:t>
+      </w:r>
+      <w:r>
+        <w:rPr>
+          <w:rFonts w:ascii="Arial" w:cs="Arial" w:eastAsia="Arial" w:hAnsi="Arial"/>
+          <w:b w:val="0"/>
+          <w:bCs w:val="0"/>
+          <w:i w:val="0"/>
+          <w:iCs w:val="0"/>
+          <w:smallCaps w:val="0"/>
+          <w:strike w:val="0"/>
+          <w:color w:val="000000"/>
+          <w:u w:val="none"/>
+          <w:shd w:fill="auto" w:val="clear"/>
+          <w:vertAlign w:val="baseline"/>
+          <w:rtl w:val="0"/>
+        </w:rPr>
+        <w:t xml:space="preserve">, reducing client integration effort by approximately 50%; engineered USB-over-WebSocket tunneling and a secure client daemon, enabling remote Android debugging across </w:t>
+      </w:r>
+      <w:r>
+        <w:rPr>
+          <w:rFonts w:ascii="Arial" w:cs="Arial" w:eastAsia="Arial" w:hAnsi="Arial"/>
+          <w:b w:val="1"/>
+          <w:bCs w:val="1"/>
+          <w:i w:val="0"/>
+          <w:iCs w:val="0"/>
+          <w:smallCaps w:val="0"/>
+          <w:strike w:val="0"/>
+          <w:color w:val="000000"/>
+          <w:u w:val="none"/>
+          <w:shd w:fill="auto" w:val="clear"/>
+          <w:vertAlign w:val="baseline"/>
+          <w:rtl w:val="0"/>
+        </w:rPr>
+        <w:t xml:space="preserve">100+ devices</w:t>
+      </w:r>
+      <w:r>
+        <w:rPr>
+          <w:rFonts w:ascii="Arial" w:cs="Arial" w:eastAsia="Arial" w:hAnsi="Arial"/>
+          <w:b w:val="0"/>
+          <w:bCs w:val="0"/>
+          <w:i w:val="0"/>
+          <w:iCs w:val="0"/>
+          <w:smallCaps w:val="0"/>
+          <w:strike w:val="0"/>
+          <w:color w:val="000000"/>
+          <w:u w:val="none"/>
+          <w:shd w:fill="auto" w:val="clear"/>
+          <w:vertAlign w:val="baseline"/>
+          <w:rtl w:val="0"/>
+        </w:rPr>
+        <w:t xml:space="preserve">.</w:t>
+      </w:r>
+      <w:r>
+        <w:rPr>
+          <w:rtl w:val="0"/>
+        </w:rPr>
       </w:r>
     </w:p>
     <w:p>
@@ -528,7 +947,7 @@
         <w:widowControl w:val="1"/>
         <w:numPr>
           <w:ilvl w:val="0"/>
-          <w:numId w:val="1"/>
+          <w:numId w:val="2"/>
         </w:numPr>
         <w:pBdr>
           <w:top w:space="0" w:sz="0" w:val="nil"/>
@@ -538,10 +957,20 @@
           <w:between w:space="0" w:sz="0" w:val="nil"/>
         </w:pBdr>
         <w:shd w:fill="auto" w:val="clear"/>
-        <w:spacing w:after="0" w:before="0" w:line="276" w:lineRule="auto"/>
-        <w:ind w:left="259" w:right="0" w:hanging="173"/>
+        <w:spacing w:after="0" w:before="60" w:line="240" w:lineRule="auto"/>
+        <w:ind w:left="720" w:right="0" w:hanging="360"/>
         <w:jc w:val="left"/>
-        <w:rPr/>
+        <w:rPr>
+          <w:rFonts w:ascii="Arial" w:cs="Arial" w:eastAsia="Arial" w:hAnsi="Arial"/>
+          <w:i w:val="0"/>
+          <w:iCs w:val="0"/>
+          <w:smallCaps w:val="0"/>
+          <w:strike w:val="0"/>
+          <w:color w:val="000000"/>
+          <w:u w:val="none"/>
+          <w:shd w:fill="auto" w:val="clear"/>
+          <w:vertAlign w:val="baseline"/>
+        </w:rPr>
       </w:pPr>
       <w:r>
         <w:rPr>
@@ -553,14 +982,51 @@
           <w:smallCaps w:val="0"/>
           <w:strike w:val="0"/>
           <w:color w:val="000000"/>
-          <w:sz w:val="19"/>
-          <w:szCs w:val="19"/>
           <w:u w:val="none"/>
           <w:shd w:fill="auto" w:val="clear"/>
           <w:vertAlign w:val="baseline"/>
           <w:rtl w:val="0"/>
         </w:rPr>
-        <w:t xml:space="preserve">Invented a USB-over-WebSocket tunnelling solution: encapsulated ADB packets in TCP sockets, pushed them through a WebSocket relay, and built a secure client-side daemon — allowing customers to remotely access physical Android devices for local debugging from any machine.</w:t>
+        <w:t xml:space="preserve">Built multi-agent AI workflows with LangChain and LangGraph to automate testing and analysis, reducing manual effort by 40%; integrated MCP, LiteLLM and Langfuse to standardize tool access, abstract LLM providers and trace </w:t>
+      </w:r>
+      <w:r>
+        <w:rPr>
+          <w:rFonts w:ascii="Arial" w:cs="Arial" w:eastAsia="Arial" w:hAnsi="Arial"/>
+          <w:b w:val="1"/>
+          <w:bCs w:val="1"/>
+          <w:i w:val="0"/>
+          <w:iCs w:val="0"/>
+          <w:smallCaps w:val="0"/>
+          <w:strike w:val="0"/>
+          <w:color w:val="000000"/>
+          <w:u w:val="none"/>
+          <w:shd w:fill="auto" w:val="clear"/>
+          <w:vertAlign w:val="baseline"/>
+          <w:rtl w:val="0"/>
+        </w:rPr>
+        <w:t xml:space="preserve">1,000+ workflow executions</w:t>
+      </w:r>
+      <w:r>
+        <w:rPr>
+          <w:rFonts w:ascii="Arial" w:cs="Arial" w:eastAsia="Arial" w:hAnsi="Arial"/>
+          <w:b w:val="0"/>
+          <w:bCs w:val="0"/>
+          <w:i w:val="0"/>
+          <w:iCs w:val="0"/>
+          <w:smallCaps w:val="0"/>
+          <w:strike w:val="0"/>
+          <w:color w:val="000000"/>
+          <w:u w:val="none"/>
+          <w:shd w:fill="auto" w:val="clear"/>
+          <w:vertAlign w:val="baseline"/>
+          <w:rtl w:val="0"/>
+        </w:rPr>
+        <w:t xml:space="preserve">.</w:t>
+      </w:r>
+      <w:r>
+        <w:rPr>
+          <w:rtl w:val="0"/>
+        </w:rPr>
       </w:r>
     </w:p>
     <w:p>
@@ -571,7 +1037,7 @@
         <w:widowControl w:val="1"/>
         <w:numPr>
           <w:ilvl w:val="0"/>
-          <w:numId w:val="1"/>
+          <w:numId w:val="2"/>
         </w:numPr>
         <w:pBdr>
           <w:top w:space="0" w:sz="0" w:val="nil"/>
@@ -581,10 +1047,20 @@
           <w:between w:space="0" w:sz="0" w:val="nil"/>
         </w:pBdr>
         <w:shd w:fill="auto" w:val="clear"/>
-        <w:spacing w:after="0" w:before="0" w:line="276" w:lineRule="auto"/>
-        <w:ind w:left="259" w:right="0" w:hanging="173"/>
+        <w:spacing w:after="0" w:before="60" w:line="240" w:lineRule="auto"/>
+        <w:ind w:left="720" w:right="0" w:hanging="360"/>
         <w:jc w:val="left"/>
-        <w:rPr/>
+        <w:rPr>
+          <w:rFonts w:ascii="Arial" w:cs="Arial" w:eastAsia="Arial" w:hAnsi="Arial"/>
+          <w:i w:val="0"/>
+          <w:iCs w:val="0"/>
+          <w:smallCaps w:val="0"/>
+          <w:strike w:val="0"/>
+          <w:color w:val="000000"/>
+          <w:u w:val="none"/>
+          <w:shd w:fill="auto" w:val="clear"/>
+          <w:vertAlign w:val="baseline"/>
+        </w:rPr>
       </w:pPr>
       <w:r>
         <w:rPr>
@@ -596,14 +1072,51 @@
           <w:smallCaps w:val="0"/>
           <w:strike w:val="0"/>
           <w:color w:val="000000"/>
-          <w:sz w:val="19"/>
-          <w:szCs w:val="19"/>
           <w:u w:val="none"/>
           <w:shd w:fill="auto" w:val="clear"/>
           <w:vertAlign w:val="baseline"/>
           <w:rtl w:val="0"/>
         </w:rPr>
-        <w:t xml:space="preserve">Designed and shipped an Appium Orchestrator that authenticates user sessions, routes automation traffic, and connects to the customer's allocated device — enabling full remote automation workflows.</w:t>
+        <w:t xml:space="preserve">Built Kubernetes-based browser automation infrastructure for Selenium, Cypress and Playwright, enabling </w:t>
+      </w:r>
+      <w:r>
+        <w:rPr>
+          <w:rFonts w:ascii="Arial" w:cs="Arial" w:eastAsia="Arial" w:hAnsi="Arial"/>
+          <w:b w:val="1"/>
+          <w:bCs w:val="1"/>
+          <w:i w:val="0"/>
+          <w:iCs w:val="0"/>
+          <w:smallCaps w:val="0"/>
+          <w:strike w:val="0"/>
+          <w:color w:val="000000"/>
+          <w:u w:val="none"/>
+          <w:shd w:fill="auto" w:val="clear"/>
+          <w:vertAlign w:val="baseline"/>
+          <w:rtl w:val="0"/>
+        </w:rPr>
+        <w:t xml:space="preserve">20+ parallel executions</w:t>
+      </w:r>
+      <w:r>
+        <w:rPr>
+          <w:rFonts w:ascii="Arial" w:cs="Arial" w:eastAsia="Arial" w:hAnsi="Arial"/>
+          <w:b w:val="0"/>
+          <w:bCs w:val="0"/>
+          <w:i w:val="0"/>
+          <w:iCs w:val="0"/>
+          <w:smallCaps w:val="0"/>
+          <w:strike w:val="0"/>
+          <w:color w:val="000000"/>
+          <w:u w:val="none"/>
+          <w:shd w:fill="auto" w:val="clear"/>
+          <w:vertAlign w:val="baseline"/>
+          <w:rtl w:val="0"/>
+        </w:rPr>
+        <w:t xml:space="preserve"> through dynamic resource allocation and improving resource utilization by 30%; engineered Stripe-based usage billing with Redis Pub/Sub, reducing manual usage reconciliation by 70%.</w:t>
+      </w:r>
+      <w:r>
+        <w:rPr>
+          <w:rtl w:val="0"/>
+        </w:rPr>
       </w:r>
     </w:p>
     <w:p>
@@ -614,7 +1127,7 @@
         <w:widowControl w:val="1"/>
         <w:numPr>
           <w:ilvl w:val="0"/>
-          <w:numId w:val="1"/>
+          <w:numId w:val="2"/>
         </w:numPr>
         <w:pBdr>
           <w:top w:space="0" w:sz="0" w:val="nil"/>
@@ -624,10 +1137,20 @@
           <w:between w:space="0" w:sz="0" w:val="nil"/>
         </w:pBdr>
         <w:shd w:fill="auto" w:val="clear"/>
-        <w:spacing w:after="0" w:before="0" w:line="276" w:lineRule="auto"/>
-        <w:ind w:left="259" w:right="0" w:hanging="173"/>
+        <w:spacing w:after="0" w:before="60" w:line="240" w:lineRule="auto"/>
+        <w:ind w:left="720" w:right="0" w:hanging="360"/>
         <w:jc w:val="left"/>
-        <w:rPr/>
+        <w:rPr>
+          <w:rFonts w:ascii="Arial" w:cs="Arial" w:eastAsia="Arial" w:hAnsi="Arial"/>
+          <w:i w:val="0"/>
+          <w:iCs w:val="0"/>
+          <w:smallCaps w:val="0"/>
+          <w:strike w:val="0"/>
+          <w:color w:val="000000"/>
+          <w:u w:val="none"/>
+          <w:shd w:fill="auto" w:val="clear"/>
+          <w:vertAlign w:val="baseline"/>
+        </w:rPr>
       </w:pPr>
       <w:r>
         <w:rPr>
@@ -639,39 +1162,30 @@
           <w:smallCaps w:val="0"/>
           <w:strike w:val="0"/>
           <w:color w:val="000000"/>
-          <w:sz w:val="19"/>
-          <w:szCs w:val="19"/>
           <w:u w:val="none"/>
           <w:shd w:fill="auto" w:val="clear"/>
           <w:vertAlign w:val="baseline"/>
           <w:rtl w:val="0"/>
         </w:rPr>
-        <w:t xml:space="preserve">Delivered FlintAPI (a public device-access REST API) end-to-end within one week; received direct appreciation from the client for speed and quality of the delivery.</w:t>
+        <w:t xml:space="preserve">Conducted system-design and knowledge-sharing sessions for </w:t>
       </w:r>
-    </w:p>
-    <w:p>
-      <w:pPr>
-        <w:keepNext w:val="0"/>
-        <w:keepLines w:val="0"/>
-        <w:pageBreakBefore w:val="0"/>
-        <w:widowControl w:val="1"/>
-        <w:numPr>
-          <w:ilvl w:val="0"/>
-          <w:numId w:val="1"/>
-        </w:numPr>
-        <w:pBdr>
-          <w:top w:space="0" w:sz="0" w:val="nil"/>
-          <w:left w:space="0" w:sz="0" w:val="nil"/>
-          <w:bottom w:space="0" w:sz="0" w:val="nil"/>
-          <w:right w:space="0" w:sz="0" w:val="nil"/>
-          <w:between w:space="0" w:sz="0" w:val="nil"/>
-        </w:pBdr>
-        <w:shd w:fill="auto" w:val="clear"/>
-        <w:spacing w:after="0" w:before="0" w:line="276" w:lineRule="auto"/>
-        <w:ind w:left="259" w:right="0" w:hanging="173"/>
-        <w:jc w:val="left"/>
-        <w:rPr/>
-      </w:pPr>
+      <w:r>
+        <w:rPr>
+          <w:rFonts w:ascii="Arial" w:cs="Arial" w:eastAsia="Arial" w:hAnsi="Arial"/>
+          <w:b w:val="1"/>
+          <w:bCs w:val="1"/>
+          <w:i w:val="0"/>
+          <w:iCs w:val="0"/>
+          <w:smallCaps w:val="0"/>
+          <w:strike w:val="0"/>
+          <w:color w:val="000000"/>
+          <w:u w:val="none"/>
+          <w:shd w:fill="auto" w:val="clear"/>
+          <w:vertAlign w:val="baseline"/>
+          <w:rtl w:val="0"/>
+        </w:rPr>
+        <w:t xml:space="preserve">10+ engineers</w:t>
+      </w:r>
       <w:r>
         <w:rPr>
           <w:rFonts w:ascii="Arial" w:cs="Arial" w:eastAsia="Arial" w:hAnsi="Arial"/>
@@ -682,39 +1196,30 @@
           <w:smallCaps w:val="0"/>
           <w:strike w:val="0"/>
           <w:color w:val="000000"/>
-          <w:sz w:val="19"/>
-          <w:szCs w:val="19"/>
           <w:u w:val="none"/>
           <w:shd w:fill="auto" w:val="clear"/>
           <w:vertAlign w:val="baseline"/>
           <w:rtl w:val="0"/>
         </w:rPr>
-        <w:t xml:space="preserve">Contributed to GCP migration and Kubernetes architecture; led internal knowledge-sharing sessions on Pods, Services, Ingress, StatefulSets, ConfigMaps, Secrets, and scheduling strategies.</w:t>
+        <w:t xml:space="preserve">, authored </w:t>
       </w:r>
-    </w:p>
-    <w:p>
-      <w:pPr>
-        <w:keepNext w:val="0"/>
-        <w:keepLines w:val="0"/>
-        <w:pageBreakBefore w:val="0"/>
-        <w:widowControl w:val="1"/>
-        <w:numPr>
-          <w:ilvl w:val="0"/>
-          <w:numId w:val="1"/>
-        </w:numPr>
-        <w:pBdr>
-          <w:top w:space="0" w:sz="0" w:val="nil"/>
-          <w:left w:space="0" w:sz="0" w:val="nil"/>
-          <w:bottom w:space="0" w:sz="0" w:val="nil"/>
-          <w:right w:space="0" w:sz="0" w:val="nil"/>
-          <w:between w:space="0" w:sz="0" w:val="nil"/>
-        </w:pBdr>
-        <w:shd w:fill="auto" w:val="clear"/>
-        <w:spacing w:after="0" w:before="0" w:line="276" w:lineRule="auto"/>
-        <w:ind w:left="259" w:right="0" w:hanging="173"/>
-        <w:jc w:val="left"/>
-        <w:rPr/>
-      </w:pPr>
+      <w:r>
+        <w:rPr>
+          <w:rFonts w:ascii="Arial" w:cs="Arial" w:eastAsia="Arial" w:hAnsi="Arial"/>
+          <w:b w:val="1"/>
+          <w:bCs w:val="1"/>
+          <w:i w:val="0"/>
+          <w:iCs w:val="0"/>
+          <w:smallCaps w:val="0"/>
+          <w:strike w:val="0"/>
+          <w:color w:val="000000"/>
+          <w:u w:val="none"/>
+          <w:shd w:fill="auto" w:val="clear"/>
+          <w:vertAlign w:val="baseline"/>
+          <w:rtl w:val="0"/>
+        </w:rPr>
+        <w:t xml:space="preserve">20+ technical design documents</w:t>
+      </w:r>
       <w:r>
         <w:rPr>
           <w:rFonts w:ascii="Arial" w:cs="Arial" w:eastAsia="Arial" w:hAnsi="Arial"/>
@@ -725,39 +1230,30 @@
           <w:smallCaps w:val="0"/>
           <w:strike w:val="0"/>
           <w:color w:val="000000"/>
-          <w:sz w:val="19"/>
-          <w:szCs w:val="19"/>
           <w:u w:val="none"/>
           <w:shd w:fill="auto" w:val="clear"/>
           <w:vertAlign w:val="baseline"/>
           <w:rtl w:val="0"/>
         </w:rPr>
-        <w:t xml:space="preserve">Designed secure Hybrid Cloud Connectivity between on-premise device hardware and cloud-hosted services using VPN-based networking across routers, switches, and GCP workloads.</w:t>
+        <w:t xml:space="preserve"> and research reports, and mentored </w:t>
       </w:r>
-    </w:p>
-    <w:p>
-      <w:pPr>
-        <w:keepNext w:val="0"/>
-        <w:keepLines w:val="0"/>
-        <w:pageBreakBefore w:val="0"/>
-        <w:widowControl w:val="1"/>
-        <w:numPr>
-          <w:ilvl w:val="0"/>
-          <w:numId w:val="1"/>
-        </w:numPr>
-        <w:pBdr>
-          <w:top w:space="0" w:sz="0" w:val="nil"/>
-          <w:left w:space="0" w:sz="0" w:val="nil"/>
-          <w:bottom w:space="0" w:sz="0" w:val="nil"/>
-          <w:right w:space="0" w:sz="0" w:val="nil"/>
-          <w:between w:space="0" w:sz="0" w:val="nil"/>
-        </w:pBdr>
-        <w:shd w:fill="auto" w:val="clear"/>
-        <w:spacing w:after="0" w:before="0" w:line="276" w:lineRule="auto"/>
-        <w:ind w:left="259" w:right="0" w:hanging="173"/>
-        <w:jc w:val="left"/>
-        <w:rPr/>
-      </w:pPr>
+      <w:r>
+        <w:rPr>
+          <w:rFonts w:ascii="Arial" w:cs="Arial" w:eastAsia="Arial" w:hAnsi="Arial"/>
+          <w:b w:val="1"/>
+          <w:bCs w:val="1"/>
+          <w:i w:val="0"/>
+          <w:iCs w:val="0"/>
+          <w:smallCaps w:val="0"/>
+          <w:strike w:val="0"/>
+          <w:color w:val="000000"/>
+          <w:u w:val="none"/>
+          <w:shd w:fill="auto" w:val="clear"/>
+          <w:vertAlign w:val="baseline"/>
+          <w:rtl w:val="0"/>
+        </w:rPr>
+        <w:t xml:space="preserve">3 engineering interns</w:t>
+      </w:r>
       <w:r>
         <w:rPr>
           <w:rFonts w:ascii="Arial" w:cs="Arial" w:eastAsia="Arial" w:hAnsi="Arial"/>
@@ -768,304 +1264,28 @@
           <w:smallCaps w:val="0"/>
           <w:strike w:val="0"/>
           <w:color w:val="000000"/>
-          <w:sz w:val="19"/>
-          <w:szCs w:val="19"/>
           <w:u w:val="none"/>
           <w:shd w:fill="auto" w:val="clear"/>
           <w:vertAlign w:val="baseline"/>
           <w:rtl w:val="0"/>
         </w:rPr>
-        <w:t xml:space="preserve">Took full ownership of iOS WebRTC diagnosed and resolved STUN/TURN issues under strict NAT environments, restoring service without escalation.</w:t>
+        <w:t xml:space="preserve"> on Python, FastAPI, Git and backend debugging, with all 3 progressing into full-time engineering roles.</w:t>
+      </w:r>
+      <w:r>
+        <w:rPr>
+          <w:rtl w:val="0"/>
+        </w:rPr>
       </w:r>
     </w:p>
     <w:p>
       <w:pPr>
-        <w:keepNext w:val="0"/>
-        <w:keepLines w:val="0"/>
-        <w:pageBreakBefore w:val="0"/>
-        <w:widowControl w:val="1"/>
-        <w:numPr>
-          <w:ilvl w:val="0"/>
-          <w:numId w:val="1"/>
-        </w:numPr>
         <w:pBdr>
-          <w:top w:space="0" w:sz="0" w:val="nil"/>
-          <w:left w:space="0" w:sz="0" w:val="nil"/>
-          <w:bottom w:space="0" w:sz="0" w:val="nil"/>
-          <w:right w:space="0" w:sz="0" w:val="nil"/>
-          <w:between w:space="0" w:sz="0" w:val="nil"/>
+          <w:bottom w:color="a6a6a6" w:space="1" w:sz="4" w:val="single"/>
         </w:pBdr>
-        <w:shd w:fill="auto" w:val="clear"/>
-        <w:spacing w:after="0" w:before="0" w:line="276" w:lineRule="auto"/>
-        <w:ind w:left="259" w:right="0" w:hanging="173"/>
-        <w:jc w:val="left"/>
-        <w:rPr/>
-      </w:pPr>
-      <w:r>
-        <w:rPr>
-          <w:rFonts w:ascii="Arial" w:cs="Arial" w:eastAsia="Arial" w:hAnsi="Arial"/>
-          <w:b w:val="0"/>
-          <w:bCs w:val="0"/>
-          <w:i w:val="0"/>
-          <w:iCs w:val="0"/>
-          <w:smallCaps w:val="0"/>
-          <w:strike w:val="0"/>
-          <w:color w:val="000000"/>
-          <w:sz w:val="19"/>
-          <w:szCs w:val="19"/>
-          <w:u w:val="none"/>
-          <w:shd w:fill="auto" w:val="clear"/>
-          <w:vertAlign w:val="baseline"/>
-          <w:rtl w:val="0"/>
-        </w:rPr>
-        <w:t xml:space="preserve">Built Browser Automation Infrastructure to support Selenium, Cypress, and Playwright on the platform — managing versioned browser containers via Kubernetes and a custom microservice for dynamic resource allocation and parallel execution.</w:t>
-      </w:r>
-    </w:p>
-    <w:p>
-      <w:pPr>
-        <w:keepNext w:val="0"/>
-        <w:keepLines w:val="0"/>
-        <w:pageBreakBefore w:val="0"/>
-        <w:widowControl w:val="1"/>
-        <w:numPr>
-          <w:ilvl w:val="0"/>
-          <w:numId w:val="1"/>
-        </w:numPr>
-        <w:pBdr>
-          <w:top w:space="0" w:sz="0" w:val="nil"/>
-          <w:left w:space="0" w:sz="0" w:val="nil"/>
-          <w:bottom w:space="0" w:sz="0" w:val="nil"/>
-          <w:right w:space="0" w:sz="0" w:val="nil"/>
-          <w:between w:space="0" w:sz="0" w:val="nil"/>
-        </w:pBdr>
-        <w:shd w:fill="auto" w:val="clear"/>
-        <w:spacing w:after="30" w:before="0" w:line="276" w:lineRule="auto"/>
-        <w:ind w:left="259" w:right="0" w:hanging="173"/>
-        <w:jc w:val="left"/>
-        <w:rPr/>
-      </w:pPr>
-      <w:r>
-        <w:rPr>
-          <w:rFonts w:ascii="Arial" w:cs="Arial" w:eastAsia="Arial" w:hAnsi="Arial"/>
-          <w:b w:val="0"/>
-          <w:bCs w:val="0"/>
-          <w:i w:val="0"/>
-          <w:iCs w:val="0"/>
-          <w:smallCaps w:val="0"/>
-          <w:strike w:val="0"/>
-          <w:color w:val="000000"/>
-          <w:sz w:val="19"/>
-          <w:szCs w:val="19"/>
-          <w:u w:val="none"/>
-          <w:shd w:fill="auto" w:val="clear"/>
-          <w:vertAlign w:val="baseline"/>
-          <w:rtl w:val="0"/>
-        </w:rPr>
-        <w:t xml:space="preserve">Deep research into container-based Android device isolation (~45 MB lightweight runtimes), native Linux USB enumeration, USB-over-TCP architectures, and multi-tenant security boundaries; delivered architectural recommendations that laid the groundwork for next-generation infrastructure scaling.</w:t>
-      </w:r>
-      <w:r>
-        <w:rPr>
-          <w:rtl w:val="0"/>
-        </w:rPr>
-      </w:r>
-    </w:p>
-    <w:p>
-      <w:pPr>
-        <w:keepNext w:val="0"/>
-        <w:keepLines w:val="0"/>
-        <w:pageBreakBefore w:val="0"/>
-        <w:widowControl w:val="1"/>
-        <w:numPr>
-          <w:ilvl w:val="0"/>
-          <w:numId w:val="1"/>
-        </w:numPr>
-        <w:pBdr>
-          <w:top w:space="0" w:sz="0" w:val="nil"/>
-          <w:left w:space="0" w:sz="0" w:val="nil"/>
-          <w:bottom w:space="0" w:sz="0" w:val="nil"/>
-          <w:right w:space="0" w:sz="0" w:val="nil"/>
-          <w:between w:space="0" w:sz="0" w:val="nil"/>
-        </w:pBdr>
-        <w:shd w:fill="auto" w:val="clear"/>
-        <w:spacing w:after="30" w:before="0" w:line="276" w:lineRule="auto"/>
-        <w:ind w:left="259" w:right="0" w:hanging="173"/>
-        <w:jc w:val="left"/>
-        <w:rPr/>
-      </w:pPr>
-      <w:r>
-        <w:rPr>
-          <w:rtl w:val="0"/>
-        </w:rPr>
-        <w:t xml:space="preserve">Designed and integrated Agentic AI workflows using multiple specialized agents and orchestration, enabling coordinated multi-step execution, tool usage, and result aggregation.</w:t>
-      </w:r>
-    </w:p>
-    <w:p>
-      <w:pPr>
-        <w:keepNext w:val="0"/>
-        <w:keepLines w:val="0"/>
-        <w:pageBreakBefore w:val="0"/>
-        <w:widowControl w:val="1"/>
-        <w:numPr>
-          <w:ilvl w:val="0"/>
-          <w:numId w:val="1"/>
-        </w:numPr>
-        <w:pBdr>
-          <w:top w:space="0" w:sz="0" w:val="nil"/>
-          <w:left w:space="0" w:sz="0" w:val="nil"/>
-          <w:bottom w:space="0" w:sz="0" w:val="nil"/>
-          <w:right w:space="0" w:sz="0" w:val="nil"/>
-          <w:between w:space="0" w:sz="0" w:val="nil"/>
-        </w:pBdr>
-        <w:shd w:fill="auto" w:val="clear"/>
-        <w:spacing w:after="30" w:before="0" w:line="276" w:lineRule="auto"/>
-        <w:ind w:left="259" w:right="0" w:hanging="173"/>
-        <w:jc w:val="left"/>
-        <w:rPr/>
-      </w:pPr>
-      <w:r>
-        <w:rPr>
-          <w:rtl w:val="0"/>
-        </w:rPr>
-        <w:t xml:space="preserve">Integrated LangChain, LangGraph, MCP, LiteLLM, and Langfuse for multi-agent orchestration, standardized agent-tool interaction, LLM gateway integration, and observability of agent and LLM workflows.</w:t>
-      </w:r>
-    </w:p>
-    <w:p>
-      <w:pPr>
-        <w:spacing w:after="0" w:lineRule="auto"/>
-        <w:rPr/>
-      </w:pPr>
-      <w:r>
-        <w:rPr>
-          <w:rtl w:val="0"/>
-        </w:rPr>
-      </w:r>
-    </w:p>
-    <w:p>
-      <w:pPr>
-        <w:spacing w:after="0" w:lineRule="auto"/>
-        <w:rPr/>
-      </w:pPr>
-      <w:r>
-        <w:rPr>
-          <w:b w:val="1"/>
-          <w:bCs w:val="1"/>
-          <w:sz w:val="21"/>
-          <w:szCs w:val="21"/>
-          <w:rtl w:val="0"/>
-        </w:rPr>
-        <w:t xml:space="preserve">Software Engineering Intern | FlintLab</w:t>
-      </w:r>
-      <w:r>
-        <w:rPr>
-          <w:i w:val="1"/>
-          <w:iCs w:val="1"/>
-          <w:rtl w:val="0"/>
-        </w:rPr>
-        <w:t xml:space="preserve">    Dec 2024 – Mar 2025 · Visakhapatnam</w:t>
-      </w:r>
-      <w:r>
-        <w:rPr>
-          <w:rtl w:val="0"/>
-        </w:rPr>
-      </w:r>
-    </w:p>
-    <w:p>
-      <w:pPr>
-        <w:keepNext w:val="0"/>
-        <w:keepLines w:val="0"/>
-        <w:pageBreakBefore w:val="0"/>
-        <w:widowControl w:val="1"/>
-        <w:numPr>
-          <w:ilvl w:val="0"/>
-          <w:numId w:val="1"/>
-        </w:numPr>
-        <w:pBdr>
-          <w:top w:space="0" w:sz="0" w:val="nil"/>
-          <w:left w:space="0" w:sz="0" w:val="nil"/>
-          <w:bottom w:space="0" w:sz="0" w:val="nil"/>
-          <w:right w:space="0" w:sz="0" w:val="nil"/>
-          <w:between w:space="0" w:sz="0" w:val="nil"/>
-        </w:pBdr>
-        <w:shd w:fill="auto" w:val="clear"/>
-        <w:spacing w:after="0" w:before="0" w:line="276" w:lineRule="auto"/>
-        <w:ind w:left="259" w:right="0" w:hanging="173"/>
-        <w:jc w:val="left"/>
-        <w:rPr/>
-      </w:pPr>
-      <w:r>
-        <w:rPr>
-          <w:rFonts w:ascii="Arial" w:cs="Arial" w:eastAsia="Arial" w:hAnsi="Arial"/>
-          <w:b w:val="0"/>
-          <w:bCs w:val="0"/>
-          <w:i w:val="0"/>
-          <w:iCs w:val="0"/>
-          <w:smallCaps w:val="0"/>
-          <w:strike w:val="0"/>
-          <w:color w:val="000000"/>
-          <w:sz w:val="19"/>
-          <w:szCs w:val="19"/>
-          <w:u w:val="none"/>
-          <w:shd w:fill="auto" w:val="clear"/>
-          <w:vertAlign w:val="baseline"/>
-          <w:rtl w:val="0"/>
-        </w:rPr>
-        <w:t xml:space="preserve">Onboarded into a hardware-software hybrid engineering culture; gained deep understanding of Linux server management, USB device enumeration, and mobile device allocation pipelines.</w:t>
-      </w:r>
-    </w:p>
-    <w:p>
-      <w:pPr>
-        <w:keepNext w:val="0"/>
-        <w:keepLines w:val="0"/>
-        <w:pageBreakBefore w:val="0"/>
-        <w:widowControl w:val="1"/>
-        <w:numPr>
-          <w:ilvl w:val="0"/>
-          <w:numId w:val="1"/>
-        </w:numPr>
-        <w:pBdr>
-          <w:top w:space="0" w:sz="0" w:val="nil"/>
-          <w:left w:space="0" w:sz="0" w:val="nil"/>
-          <w:bottom w:space="0" w:sz="0" w:val="nil"/>
-          <w:right w:space="0" w:sz="0" w:val="nil"/>
-          <w:between w:space="0" w:sz="0" w:val="nil"/>
-        </w:pBdr>
-        <w:shd w:fill="auto" w:val="clear"/>
-        <w:spacing w:after="30" w:before="0" w:line="276" w:lineRule="auto"/>
-        <w:ind w:left="259" w:right="0" w:hanging="173"/>
-        <w:jc w:val="left"/>
-        <w:rPr/>
-      </w:pPr>
-      <w:r>
-        <w:rPr>
-          <w:rFonts w:ascii="Arial" w:cs="Arial" w:eastAsia="Arial" w:hAnsi="Arial"/>
-          <w:b w:val="0"/>
-          <w:bCs w:val="0"/>
-          <w:i w:val="0"/>
-          <w:iCs w:val="0"/>
-          <w:smallCaps w:val="0"/>
-          <w:strike w:val="0"/>
-          <w:color w:val="000000"/>
-          <w:sz w:val="19"/>
-          <w:szCs w:val="19"/>
-          <w:u w:val="none"/>
-          <w:shd w:fill="auto" w:val="clear"/>
-          <w:vertAlign w:val="baseline"/>
-          <w:rtl w:val="0"/>
-        </w:rPr>
-        <w:t xml:space="preserve">Promoted to full-time employee after three months based on technical contributions and initiative.</w:t>
-      </w:r>
-      <w:r>
-        <w:rPr>
-          <w:rtl w:val="0"/>
-        </w:rPr>
-      </w:r>
-    </w:p>
-    <w:p>
-      <w:pPr>
-        <w:spacing w:after="60" w:before="220" w:line="276" w:lineRule="auto"/>
-        <w:rPr>
-          <w:b w:val="1"/>
-          <w:bCs w:val="1"/>
+        <w:spacing w:after="32" w:before="220" w:line="240" w:lineRule="auto"/>
+        <w:rPr>
+          <w:sz w:val="20"/>
+          <w:szCs w:val="20"/>
         </w:rPr>
       </w:pPr>
       <w:r>
@@ -1073,11 +1293,12 @@
           <w:rFonts w:ascii="Arial" w:cs="Arial" w:eastAsia="Arial" w:hAnsi="Arial"/>
           <w:b w:val="1"/>
           <w:bCs w:val="1"/>
-          <w:sz w:val="22"/>
-          <w:szCs w:val="22"/>
+          <w:color w:val="000000"/>
+          <w:sz w:val="20"/>
+          <w:szCs w:val="20"/>
           <w:rtl w:val="0"/>
         </w:rPr>
-        <w:t xml:space="preserve">EDUCATION</w:t>
+        <w:t xml:space="preserve">Projects</w:t>
       </w:r>
       <w:r>
         <w:rPr>
@@ -1091,22 +1312,36 @@
           <w:ilvl w:val="0"/>
           <w:numId w:val="1"/>
         </w:numPr>
-        <w:spacing w:after="30" w:lineRule="auto"/>
-        <w:ind w:left="259" w:hanging="173"/>
+        <w:spacing w:after="0" w:before="60" w:line="240" w:lineRule="auto"/>
+        <w:ind w:left="720" w:hanging="360"/>
+        <w:rPr>
+          <w:rFonts w:ascii="Arial" w:cs="Arial" w:eastAsia="Arial" w:hAnsi="Arial"/>
+          <w:color w:val="000000"/>
+          <w:u w:val="none"/>
+        </w:rPr>
       </w:pPr>
       <w:r>
         <w:rPr>
+          <w:rFonts w:ascii="Arial" w:cs="Arial" w:eastAsia="Arial" w:hAnsi="Arial"/>
           <w:b w:val="1"/>
           <w:bCs w:val="1"/>
+          <w:color w:val="000000"/>
           <w:rtl w:val="0"/>
         </w:rPr>
-        <w:t xml:space="preserve">B.Tech — Computer Science &amp; Engineering</w:t>
+        <w:t xml:space="preserve">DevAutoFlow-MCP — Python, FastAPI, MCP, TypeScript, ADB: </w:t>
       </w:r>
       <w:r>
         <w:rPr>
+          <w:rFonts w:ascii="Arial" w:cs="Arial" w:eastAsia="Arial" w:hAnsi="Arial"/>
+          <w:color w:val="000000"/>
           <w:rtl w:val="0"/>
         </w:rPr>
-        <w:t xml:space="preserve">  |  Andhra University College of Engineering, Visakhapatnam · 2021 – 2025 · CGPA: 8.66 / 10</w:t>
+        <w:t xml:space="preserve">Built an MCP-based mobile automation platform supporting parallel APK installation and test execution across multiple devices, reducing manual setup effort by 60%.</w:t>
+      </w:r>
+      <w:r>
+        <w:rPr>
+          <w:rtl w:val="0"/>
+        </w:rPr>
       </w:r>
     </w:p>
     <w:p>
@@ -1115,22 +1350,76 @@
           <w:ilvl w:val="0"/>
           <w:numId w:val="1"/>
         </w:numPr>
-        <w:spacing w:after="30" w:lineRule="auto"/>
-        <w:ind w:left="259" w:hanging="173"/>
+        <w:spacing w:after="0" w:before="60" w:line="240" w:lineRule="auto"/>
+        <w:ind w:left="720" w:hanging="360"/>
+        <w:rPr>
+          <w:rFonts w:ascii="Arial" w:cs="Arial" w:eastAsia="Arial" w:hAnsi="Arial"/>
+          <w:color w:val="000000"/>
+          <w:u w:val="none"/>
+        </w:rPr>
       </w:pPr>
       <w:r>
         <w:rPr>
+          <w:rFonts w:ascii="Arial" w:cs="Arial" w:eastAsia="Arial" w:hAnsi="Arial"/>
+          <w:color w:val="000000"/>
+          <w:rtl w:val="0"/>
+        </w:rPr>
+        <w:t xml:space="preserve">Secure Environment Orchestrator — Python, Firecracker, KVM, Linux, MicroVMs: Built a secure workload orchestrator using Amazon Firecracker</w:t>
+      </w:r>
+      <w:r>
+        <w:rPr>
+          <w:rtl w:val="0"/>
+        </w:rPr>
+        <w:t xml:space="preserve"> </w:t>
+      </w:r>
+      <w:r>
+        <w:rPr>
+          <w:rFonts w:ascii="Arial" w:cs="Arial" w:eastAsia="Arial" w:hAnsi="Arial"/>
+          <w:color w:val="000000"/>
+          <w:rtl w:val="0"/>
+        </w:rPr>
+        <w:t xml:space="preserve">KVM MicroVMs for isolated execution, targeting </w:t>
+      </w:r>
+      <w:r>
+        <w:rPr>
+          <w:rFonts w:ascii="Arial" w:cs="Arial" w:eastAsia="Arial" w:hAnsi="Arial"/>
           <w:b w:val="1"/>
           <w:bCs w:val="1"/>
+          <w:color w:val="000000"/>
           <w:rtl w:val="0"/>
         </w:rPr>
-        <w:t xml:space="preserve">Intermediate (MPC)</w:t>
+        <w:t xml:space="preserve">&lt; 100 MB</w:t>
       </w:r>
       <w:r>
         <w:rPr>
+          <w:rFonts w:ascii="Arial" w:cs="Arial" w:eastAsia="Arial" w:hAnsi="Arial"/>
+          <w:color w:val="000000"/>
           <w:rtl w:val="0"/>
         </w:rPr>
-        <w:t xml:space="preserve">  |  Vignan's Co-operative Junior College, Guntur · 2019 – 2021 · 96.9%</w:t>
+        <w:t xml:space="preserve"> runtimes and </w:t>
+      </w:r>
+      <w:r>
+        <w:rPr>
+          <w:rFonts w:ascii="Arial" w:cs="Arial" w:eastAsia="Arial" w:hAnsi="Arial"/>
+          <w:b w:val="1"/>
+          <w:bCs w:val="1"/>
+          <w:color w:val="000000"/>
+          <w:rtl w:val="0"/>
+        </w:rPr>
+        <w:t xml:space="preserve">sub-second environment creation</w:t>
+      </w:r>
+      <w:r>
+        <w:rPr>
+          <w:rFonts w:ascii="Arial" w:cs="Arial" w:eastAsia="Arial" w:hAnsi="Arial"/>
+          <w:color w:val="000000"/>
+          <w:rtl w:val="0"/>
+        </w:rPr>
+        <w:t xml:space="preserve"> with lower resource overhead than traditional VMs.</w:t>
+      </w:r>
+      <w:r>
+        <w:rPr>
+          <w:rtl w:val="0"/>
+        </w:rPr>
       </w:r>
     </w:p>
     <w:p>
@@ -1139,22 +1428,39 @@
           <w:ilvl w:val="0"/>
           <w:numId w:val="1"/>
         </w:numPr>
-        <w:spacing w:after="30" w:lineRule="auto"/>
-        <w:ind w:left="259" w:hanging="173"/>
+        <w:spacing w:after="0" w:before="60" w:line="240" w:lineRule="auto"/>
+        <w:ind w:left="720" w:hanging="360"/>
+        <w:rPr>
+          <w:rFonts w:ascii="Arial" w:cs="Arial" w:eastAsia="Arial" w:hAnsi="Arial"/>
+          <w:color w:val="000000"/>
+          <w:u w:val="none"/>
+        </w:rPr>
       </w:pPr>
       <w:r>
         <w:rPr>
+          <w:rFonts w:ascii="Arial" w:cs="Arial" w:eastAsia="Arial" w:hAnsi="Arial"/>
+          <w:color w:val="000000"/>
+          <w:rtl w:val="0"/>
+        </w:rPr>
+        <w:t xml:space="preserve">Cloud-Native Microservices — AWS, Kubernetes, Docker, Terraform: Provisioned and deployed </w:t>
+      </w:r>
+      <w:r>
+        <w:rPr>
+          <w:rFonts w:ascii="Arial" w:cs="Arial" w:eastAsia="Arial" w:hAnsi="Arial"/>
           <w:b w:val="1"/>
           <w:bCs w:val="1"/>
+          <w:color w:val="000000"/>
           <w:rtl w:val="0"/>
         </w:rPr>
-        <w:t xml:space="preserve">10th Standard</w:t>
+        <w:t xml:space="preserve">5 containerized microservices</w:t>
       </w:r>
       <w:r>
         <w:rPr>
+          <w:rFonts w:ascii="Arial" w:cs="Arial" w:eastAsia="Arial" w:hAnsi="Arial"/>
+          <w:color w:val="000000"/>
           <w:rtl w:val="0"/>
         </w:rPr>
-        <w:t xml:space="preserve">  |  Apex High School, Ongole · 2018 – 2019 · 10.0 / 10</w:t>
+        <w:t xml:space="preserve"> on AWS Kubernetes using Terraform, reducing manual infrastructure setup by 70% through Infrastructure as Code.</w:t>
       </w:r>
       <w:r>
         <w:rPr>
@@ -1164,19 +1470,26 @@
     </w:p>
     <w:p>
       <w:pPr>
-        <w:spacing w:after="60" w:before="220" w:line="276" w:lineRule="auto"/>
-        <w:rPr/>
+        <w:pBdr>
+          <w:bottom w:color="a6a6a6" w:space="1" w:sz="4" w:val="single"/>
+        </w:pBdr>
+        <w:spacing w:after="32" w:before="220" w:line="240" w:lineRule="auto"/>
+        <w:rPr>
+          <w:sz w:val="20"/>
+          <w:szCs w:val="20"/>
+        </w:rPr>
       </w:pPr>
       <w:r>
         <w:rPr>
           <w:rFonts w:ascii="Arial" w:cs="Arial" w:eastAsia="Arial" w:hAnsi="Arial"/>
           <w:b w:val="1"/>
           <w:bCs w:val="1"/>
-          <w:sz w:val="22"/>
-          <w:szCs w:val="22"/>
+          <w:color w:val="000000"/>
+          <w:sz w:val="20"/>
+          <w:szCs w:val="20"/>
           <w:rtl w:val="0"/>
         </w:rPr>
-        <w:t xml:space="preserve">NOTABLE PROJECTS</w:t>
+        <w:t xml:space="preserve">Education</w:t>
       </w:r>
       <w:r>
         <w:rPr>
@@ -1186,128 +1499,98 @@
     </w:p>
     <w:p>
       <w:pPr>
-        <w:spacing w:after="0" w:lineRule="auto"/>
-        <w:rPr/>
+        <w:spacing w:after="9" w:before="0" w:line="240" w:lineRule="auto"/>
+        <w:rPr>
+          <w:sz w:val="20"/>
+          <w:szCs w:val="20"/>
+        </w:rPr>
       </w:pPr>
       <w:r>
         <w:rPr>
-          <w:b w:val="1"/>
-          <w:bCs w:val="1"/>
+          <w:rFonts w:ascii="Arial" w:cs="Arial" w:eastAsia="Arial" w:hAnsi="Arial"/>
+          <w:b w:val="0"/>
+          <w:bCs w:val="0"/>
+          <w:color w:val="000000"/>
           <w:rtl w:val="0"/>
         </w:rPr>
-        <w:t xml:space="preserve">Contact Manager Application · Spring Boot, MySQL</w:t>
+        <w:t xml:space="preserve">B.Tech, Computer Science &amp; Engineering — Andhra University College of Engineering | 2021–2025 | CGPA: 8.66/10</w:t>
       </w:r>
       <w:r>
         <w:rPr>
           <w:rtl w:val="0"/>
         </w:rPr>
-        <w:t xml:space="preserve"> — College Project</w:t>
       </w:r>
     </w:p>
     <w:p>
       <w:pPr>
-        <w:keepNext w:val="0"/>
-        <w:keepLines w:val="0"/>
-        <w:pageBreakBefore w:val="0"/>
-        <w:widowControl w:val="1"/>
-        <w:numPr>
-          <w:ilvl w:val="0"/>
-          <w:numId w:val="1"/>
-        </w:numPr>
-        <w:pBdr>
-          <w:top w:space="0" w:sz="0" w:val="nil"/>
-          <w:left w:space="0" w:sz="0" w:val="nil"/>
-          <w:bottom w:space="0" w:sz="0" w:val="nil"/>
-          <w:right w:space="0" w:sz="0" w:val="nil"/>
-          <w:between w:space="0" w:sz="0" w:val="nil"/>
-        </w:pBdr>
-        <w:shd w:fill="auto" w:val="clear"/>
-        <w:spacing w:after="30" w:before="0" w:line="276" w:lineRule="auto"/>
-        <w:ind w:left="259" w:right="0" w:hanging="173"/>
-        <w:jc w:val="left"/>
-        <w:rPr/>
+        <w:spacing w:after="9" w:before="0" w:line="240" w:lineRule="auto"/>
+        <w:rPr>
+          <w:sz w:val="20"/>
+          <w:szCs w:val="20"/>
+        </w:rPr>
       </w:pPr>
       <w:r>
         <w:rPr>
           <w:rFonts w:ascii="Arial" w:cs="Arial" w:eastAsia="Arial" w:hAnsi="Arial"/>
           <w:b w:val="0"/>
           <w:bCs w:val="0"/>
-          <w:i w:val="0"/>
-          <w:iCs w:val="0"/>
-          <w:smallCaps w:val="0"/>
-          <w:strike w:val="0"/>
           <w:color w:val="000000"/>
-          <w:sz w:val="19"/>
-          <w:szCs w:val="19"/>
-          <w:u w:val="none"/>
-          <w:shd w:fill="auto" w:val="clear"/>
-          <w:vertAlign w:val="baseline"/>
           <w:rtl w:val="0"/>
         </w:rPr>
-        <w:t xml:space="preserve">Full-stack web application built during self-directed learning, covering Spring Boot, REST APIs, and session management.</w:t>
+        <w:t xml:space="preserve">Intermediate (MPC) — Vignan's Co-operative Junior College, Guntur | 2019–2021 | 96.9%</w:t>
+      </w:r>
+      <w:r>
+        <w:rPr>
+          <w:rtl w:val="0"/>
+        </w:rPr>
       </w:r>
     </w:p>
     <w:p>
       <w:pPr>
-        <w:spacing w:after="0" w:lineRule="auto"/>
-        <w:rPr/>
+        <w:pBdr>
+          <w:bottom w:color="a6a6a6" w:space="1" w:sz="4" w:val="single"/>
+        </w:pBdr>
+        <w:spacing w:after="32" w:before="220" w:line="240" w:lineRule="auto"/>
+        <w:rPr>
+          <w:sz w:val="20"/>
+          <w:szCs w:val="20"/>
+        </w:rPr>
       </w:pPr>
       <w:r>
         <w:rPr>
+          <w:rFonts w:ascii="Arial" w:cs="Arial" w:eastAsia="Arial" w:hAnsi="Arial"/>
           <w:b w:val="1"/>
           <w:bCs w:val="1"/>
+          <w:color w:val="000000"/>
+          <w:sz w:val="20"/>
+          <w:szCs w:val="20"/>
           <w:rtl w:val="0"/>
         </w:rPr>
-        <w:t xml:space="preserve">3-Tier Microservices on Kubernetes (AWS)</w:t>
+        <w:t xml:space="preserve">Certifications &amp; Training</w:t>
       </w:r>
       <w:r>
         <w:rPr>
           <w:rtl w:val="0"/>
         </w:rPr>
-        <w:t xml:space="preserve"> · Docker, Kubernetes, AWS — College Project</w:t>
       </w:r>
     </w:p>
     <w:p>
       <w:pPr>
-        <w:keepNext w:val="0"/>
-        <w:keepLines w:val="0"/>
-        <w:pageBreakBefore w:val="0"/>
-        <w:widowControl w:val="1"/>
-        <w:numPr>
-          <w:ilvl w:val="0"/>
-          <w:numId w:val="1"/>
-        </w:numPr>
-        <w:pBdr>
-          <w:top w:space="0" w:sz="0" w:val="nil"/>
-          <w:left w:space="0" w:sz="0" w:val="nil"/>
-          <w:bottom w:space="0" w:sz="0" w:val="nil"/>
-          <w:right w:space="0" w:sz="0" w:val="nil"/>
-          <w:between w:space="0" w:sz="0" w:val="nil"/>
-        </w:pBdr>
-        <w:shd w:fill="auto" w:val="clear"/>
-        <w:spacing w:after="30" w:before="0" w:line="276" w:lineRule="auto"/>
-        <w:ind w:left="259" w:right="0" w:hanging="173"/>
-        <w:jc w:val="left"/>
-        <w:rPr/>
+        <w:spacing w:after="6" w:before="0" w:line="240" w:lineRule="auto"/>
+        <w:rPr>
+          <w:sz w:val="20"/>
+          <w:szCs w:val="20"/>
+        </w:rPr>
       </w:pPr>
       <w:r>
         <w:rPr>
           <w:rFonts w:ascii="Arial" w:cs="Arial" w:eastAsia="Arial" w:hAnsi="Arial"/>
           <w:b w:val="0"/>
           <w:bCs w:val="0"/>
-          <w:i w:val="0"/>
-          <w:iCs w:val="0"/>
-          <w:smallCaps w:val="0"/>
-          <w:strike w:val="0"/>
           <w:color w:val="000000"/>
-          <w:sz w:val="19"/>
-          <w:szCs w:val="19"/>
-          <w:u w:val="none"/>
-          <w:shd w:fill="auto" w:val="clear"/>
-          <w:vertAlign w:val="baseline"/>
           <w:rtl w:val="0"/>
         </w:rPr>
-        <w:t xml:space="preserve">Designed, containerised, and deployed a production-style three-tier application on Kubernetes, end-to-end — from infrastructure provisioning to live traffic routing.</w:t>
+        <w:t xml:space="preserve">Java (Basic to Advanced) — Udemy | July 2023</w:t>
       </w:r>
       <w:r>
         <w:rPr>
@@ -1317,19 +1600,21 @@
     </w:p>
     <w:p>
       <w:pPr>
-        <w:spacing w:after="60" w:before="220" w:line="276" w:lineRule="auto"/>
-        <w:rPr/>
+        <w:spacing w:after="6" w:before="0" w:line="240" w:lineRule="auto"/>
+        <w:rPr>
+          <w:sz w:val="20"/>
+          <w:szCs w:val="20"/>
+        </w:rPr>
       </w:pPr>
       <w:r>
         <w:rPr>
           <w:rFonts w:ascii="Arial" w:cs="Arial" w:eastAsia="Arial" w:hAnsi="Arial"/>
-          <w:b w:val="1"/>
-          <w:bCs w:val="1"/>
-          <w:sz w:val="22"/>
-          <w:szCs w:val="22"/>
+          <w:b w:val="0"/>
+          <w:bCs w:val="0"/>
+          <w:color w:val="000000"/>
           <w:rtl w:val="0"/>
         </w:rPr>
-        <w:t xml:space="preserve">CERTIFICATIONS &amp; TRAINING</w:t>
+        <w:t xml:space="preserve">Understanding Kafka &amp; Zookeeper — Scaler | July 2024</w:t>
       </w:r>
       <w:r>
         <w:rPr>
@@ -1339,378 +1624,31 @@
     </w:p>
     <w:p>
       <w:pPr>
-        <w:keepNext w:val="0"/>
-        <w:keepLines w:val="0"/>
-        <w:pageBreakBefore w:val="0"/>
-        <w:widowControl w:val="1"/>
-        <w:numPr>
-          <w:ilvl w:val="0"/>
-          <w:numId w:val="1"/>
-        </w:numPr>
-        <w:pBdr>
-          <w:top w:space="0" w:sz="0" w:val="nil"/>
-          <w:left w:space="0" w:sz="0" w:val="nil"/>
-          <w:bottom w:space="0" w:sz="0" w:val="nil"/>
-          <w:right w:space="0" w:sz="0" w:val="nil"/>
-          <w:between w:space="0" w:sz="0" w:val="nil"/>
-        </w:pBdr>
-        <w:shd w:fill="auto" w:val="clear"/>
-        <w:spacing w:after="0" w:before="0" w:line="276" w:lineRule="auto"/>
-        <w:ind w:left="259" w:right="0" w:hanging="173"/>
-        <w:jc w:val="left"/>
-        <w:rPr/>
+        <w:spacing w:after="6" w:before="0" w:line="240" w:lineRule="auto"/>
+        <w:rPr>
+          <w:sz w:val="20"/>
+          <w:szCs w:val="20"/>
+        </w:rPr>
       </w:pPr>
       <w:r>
         <w:rPr>
           <w:rFonts w:ascii="Arial" w:cs="Arial" w:eastAsia="Arial" w:hAnsi="Arial"/>
           <w:b w:val="0"/>
           <w:bCs w:val="0"/>
-          <w:i w:val="0"/>
-          <w:iCs w:val="0"/>
-          <w:smallCaps w:val="0"/>
-          <w:strike w:val="0"/>
           <w:color w:val="000000"/>
-          <w:sz w:val="19"/>
-          <w:szCs w:val="19"/>
-          <w:u w:val="none"/>
-          <w:shd w:fill="auto" w:val="clear"/>
-          <w:vertAlign w:val="baseline"/>
           <w:rtl w:val="0"/>
         </w:rPr>
-        <w:t xml:space="preserve">Java (Basic to Advanced) — Udemy, July 2023</w:t>
-      </w:r>
-    </w:p>
-    <w:p>
-      <w:pPr>
-        <w:keepNext w:val="0"/>
-        <w:keepLines w:val="0"/>
-        <w:pageBreakBefore w:val="0"/>
-        <w:widowControl w:val="1"/>
-        <w:numPr>
-          <w:ilvl w:val="0"/>
-          <w:numId w:val="1"/>
-        </w:numPr>
-        <w:pBdr>
-          <w:top w:space="0" w:sz="0" w:val="nil"/>
-          <w:left w:space="0" w:sz="0" w:val="nil"/>
-          <w:bottom w:space="0" w:sz="0" w:val="nil"/>
-          <w:right w:space="0" w:sz="0" w:val="nil"/>
-          <w:between w:space="0" w:sz="0" w:val="nil"/>
-        </w:pBdr>
-        <w:shd w:fill="auto" w:val="clear"/>
-        <w:spacing w:after="0" w:before="0" w:line="276" w:lineRule="auto"/>
-        <w:ind w:left="259" w:right="0" w:hanging="173"/>
-        <w:jc w:val="left"/>
-        <w:rPr/>
-      </w:pPr>
-      <w:r>
-        <w:rPr>
-          <w:rFonts w:ascii="Arial" w:cs="Arial" w:eastAsia="Arial" w:hAnsi="Arial"/>
-          <w:b w:val="0"/>
-          <w:bCs w:val="0"/>
-          <w:i w:val="0"/>
-          <w:iCs w:val="0"/>
-          <w:smallCaps w:val="0"/>
-          <w:strike w:val="0"/>
-          <w:color w:val="000000"/>
-          <w:sz w:val="19"/>
-          <w:szCs w:val="19"/>
-          <w:u w:val="none"/>
-          <w:shd w:fill="auto" w:val="clear"/>
-          <w:vertAlign w:val="baseline"/>
-          <w:rtl w:val="0"/>
-        </w:rPr>
-        <w:t xml:space="preserve">Understanding Kafka &amp; Zookeeper — Scaler, July 2024</w:t>
-      </w:r>
-    </w:p>
-    <w:p>
-      <w:pPr>
-        <w:keepNext w:val="0"/>
-        <w:keepLines w:val="0"/>
-        <w:pageBreakBefore w:val="0"/>
-        <w:widowControl w:val="1"/>
-        <w:numPr>
-          <w:ilvl w:val="0"/>
-          <w:numId w:val="1"/>
-        </w:numPr>
-        <w:pBdr>
-          <w:top w:space="0" w:sz="0" w:val="nil"/>
-          <w:left w:space="0" w:sz="0" w:val="nil"/>
-          <w:bottom w:space="0" w:sz="0" w:val="nil"/>
-          <w:right w:space="0" w:sz="0" w:val="nil"/>
-          <w:between w:space="0" w:sz="0" w:val="nil"/>
-        </w:pBdr>
-        <w:shd w:fill="auto" w:val="clear"/>
-        <w:spacing w:after="30" w:before="0" w:line="276" w:lineRule="auto"/>
-        <w:ind w:left="259" w:right="0" w:hanging="173"/>
-        <w:jc w:val="left"/>
-        <w:rPr/>
-      </w:pPr>
-      <w:r>
-        <w:rPr>
-          <w:rFonts w:ascii="Arial" w:cs="Arial" w:eastAsia="Arial" w:hAnsi="Arial"/>
-          <w:b w:val="0"/>
-          <w:bCs w:val="0"/>
-          <w:i w:val="0"/>
-          <w:iCs w:val="0"/>
-          <w:smallCaps w:val="0"/>
-          <w:strike w:val="0"/>
-          <w:color w:val="000000"/>
-          <w:sz w:val="19"/>
-          <w:szCs w:val="19"/>
-          <w:u w:val="none"/>
-          <w:shd w:fill="auto" w:val="clear"/>
-          <w:vertAlign w:val="baseline"/>
-          <w:rtl w:val="0"/>
-        </w:rPr>
-        <w:t xml:space="preserve">Cyber Security Internship — APSCHE – IIDT – Blackbucks, June–July 2024</w:t>
+        <w:t xml:space="preserve">Cyber Security Internship — APSCHE – IIDT – Blackbucks | June–July 2024</w:t>
       </w:r>
       <w:r>
         <w:rPr>
           <w:rtl w:val="0"/>
         </w:rPr>
-      </w:r>
-    </w:p>
-    <w:p>
-      <w:pPr>
-        <w:spacing w:after="60" w:before="220" w:line="276" w:lineRule="auto"/>
-        <w:rPr/>
-      </w:pPr>
-      <w:r>
-        <w:rPr>
-          <w:rFonts w:ascii="Arial" w:cs="Arial" w:eastAsia="Arial" w:hAnsi="Arial"/>
-          <w:b w:val="1"/>
-          <w:bCs w:val="1"/>
-          <w:sz w:val="22"/>
-          <w:szCs w:val="22"/>
-          <w:rtl w:val="0"/>
-        </w:rPr>
-        <w:t xml:space="preserve">LEADERSHIP &amp; CULTURE</w:t>
-      </w:r>
-      <w:r>
-        <w:rPr>
-          <w:rtl w:val="0"/>
-        </w:rPr>
-      </w:r>
-    </w:p>
-    <w:p>
-      <w:pPr>
-        <w:keepNext w:val="0"/>
-        <w:keepLines w:val="0"/>
-        <w:pageBreakBefore w:val="0"/>
-        <w:widowControl w:val="1"/>
-        <w:numPr>
-          <w:ilvl w:val="0"/>
-          <w:numId w:val="1"/>
-        </w:numPr>
-        <w:pBdr>
-          <w:top w:space="0" w:sz="0" w:val="nil"/>
-          <w:left w:space="0" w:sz="0" w:val="nil"/>
-          <w:bottom w:space="0" w:sz="0" w:val="nil"/>
-          <w:right w:space="0" w:sz="0" w:val="nil"/>
-          <w:between w:space="0" w:sz="0" w:val="nil"/>
-        </w:pBdr>
-        <w:shd w:fill="auto" w:val="clear"/>
-        <w:spacing w:after="0" w:before="0" w:line="276" w:lineRule="auto"/>
-        <w:ind w:left="259" w:right="0" w:hanging="173"/>
-        <w:jc w:val="left"/>
-        <w:rPr/>
-      </w:pPr>
-      <w:r>
-        <w:rPr>
-          <w:rFonts w:ascii="Arial" w:cs="Arial" w:eastAsia="Arial" w:hAnsi="Arial"/>
-          <w:b w:val="0"/>
-          <w:bCs w:val="0"/>
-          <w:i w:val="0"/>
-          <w:iCs w:val="0"/>
-          <w:smallCaps w:val="0"/>
-          <w:strike w:val="0"/>
-          <w:color w:val="000000"/>
-          <w:sz w:val="19"/>
-          <w:szCs w:val="19"/>
-          <w:u w:val="none"/>
-          <w:shd w:fill="auto" w:val="clear"/>
-          <w:vertAlign w:val="baseline"/>
-          <w:rtl w:val="0"/>
-        </w:rPr>
-        <w:t xml:space="preserve">Conducted weekly system design discussions for several months across the engineering team.</w:t>
-      </w:r>
-    </w:p>
-    <w:p>
-      <w:pPr>
-        <w:keepNext w:val="0"/>
-        <w:keepLines w:val="0"/>
-        <w:pageBreakBefore w:val="0"/>
-        <w:widowControl w:val="1"/>
-        <w:numPr>
-          <w:ilvl w:val="0"/>
-          <w:numId w:val="1"/>
-        </w:numPr>
-        <w:pBdr>
-          <w:top w:space="0" w:sz="0" w:val="nil"/>
-          <w:left w:space="0" w:sz="0" w:val="nil"/>
-          <w:bottom w:space="0" w:sz="0" w:val="nil"/>
-          <w:right w:space="0" w:sz="0" w:val="nil"/>
-          <w:between w:space="0" w:sz="0" w:val="nil"/>
-        </w:pBdr>
-        <w:shd w:fill="auto" w:val="clear"/>
-        <w:spacing w:after="0" w:before="0" w:line="276" w:lineRule="auto"/>
-        <w:ind w:left="259" w:right="0" w:hanging="173"/>
-        <w:jc w:val="left"/>
-        <w:rPr/>
-      </w:pPr>
-      <w:r>
-        <w:rPr>
-          <w:rFonts w:ascii="Arial" w:cs="Arial" w:eastAsia="Arial" w:hAnsi="Arial"/>
-          <w:b w:val="0"/>
-          <w:bCs w:val="0"/>
-          <w:i w:val="0"/>
-          <w:iCs w:val="0"/>
-          <w:smallCaps w:val="0"/>
-          <w:strike w:val="0"/>
-          <w:color w:val="000000"/>
-          <w:sz w:val="19"/>
-          <w:szCs w:val="19"/>
-          <w:u w:val="none"/>
-          <w:shd w:fill="auto" w:val="clear"/>
-          <w:vertAlign w:val="baseline"/>
-          <w:rtl w:val="0"/>
-        </w:rPr>
-        <w:t xml:space="preserve">Authored technical design documents, implementation notes, and research reports; maintained team knowledge base.</w:t>
-      </w:r>
-    </w:p>
-    <w:p>
-      <w:pPr>
-        <w:keepNext w:val="0"/>
-        <w:keepLines w:val="0"/>
-        <w:pageBreakBefore w:val="0"/>
-        <w:widowControl w:val="1"/>
-        <w:numPr>
-          <w:ilvl w:val="0"/>
-          <w:numId w:val="1"/>
-        </w:numPr>
-        <w:pBdr>
-          <w:top w:space="0" w:sz="0" w:val="nil"/>
-          <w:left w:space="0" w:sz="0" w:val="nil"/>
-          <w:bottom w:space="0" w:sz="0" w:val="nil"/>
-          <w:right w:space="0" w:sz="0" w:val="nil"/>
-          <w:between w:space="0" w:sz="0" w:val="nil"/>
-        </w:pBdr>
-        <w:shd w:fill="auto" w:val="clear"/>
-        <w:spacing w:after="0" w:before="0" w:line="276" w:lineRule="auto"/>
-        <w:ind w:left="259" w:right="0" w:hanging="173"/>
-        <w:jc w:val="left"/>
-        <w:rPr/>
-      </w:pPr>
-      <w:r>
-        <w:rPr>
-          <w:rFonts w:ascii="Arial" w:cs="Arial" w:eastAsia="Arial" w:hAnsi="Arial"/>
-          <w:b w:val="0"/>
-          <w:bCs w:val="0"/>
-          <w:i w:val="0"/>
-          <w:iCs w:val="0"/>
-          <w:smallCaps w:val="0"/>
-          <w:strike w:val="0"/>
-          <w:color w:val="000000"/>
-          <w:sz w:val="19"/>
-          <w:szCs w:val="19"/>
-          <w:u w:val="none"/>
-          <w:shd w:fill="auto" w:val="clear"/>
-          <w:vertAlign w:val="baseline"/>
-          <w:rtl w:val="0"/>
-        </w:rPr>
-        <w:t xml:space="preserve">Performed regular peer code reviews and ran knowledge-sharing sessions for colleagues on Kubernetes, distributed systems, and infrastructure topics.</w:t>
-      </w:r>
-    </w:p>
-    <w:p>
-      <w:pPr>
-        <w:keepNext w:val="0"/>
-        <w:keepLines w:val="0"/>
-        <w:pageBreakBefore w:val="0"/>
-        <w:widowControl w:val="1"/>
-        <w:numPr>
-          <w:ilvl w:val="0"/>
-          <w:numId w:val="1"/>
-        </w:numPr>
-        <w:pBdr>
-          <w:top w:space="0" w:sz="0" w:val="nil"/>
-          <w:left w:space="0" w:sz="0" w:val="nil"/>
-          <w:bottom w:space="0" w:sz="0" w:val="nil"/>
-          <w:right w:space="0" w:sz="0" w:val="nil"/>
-          <w:between w:space="0" w:sz="0" w:val="nil"/>
-        </w:pBdr>
-        <w:shd w:fill="auto" w:val="clear"/>
-        <w:spacing w:after="0" w:before="0" w:line="276" w:lineRule="auto"/>
-        <w:ind w:left="259" w:right="0" w:hanging="173"/>
-        <w:jc w:val="left"/>
-        <w:rPr/>
-      </w:pPr>
-      <w:r>
-        <w:rPr>
-          <w:rFonts w:ascii="Arial" w:cs="Arial" w:eastAsia="Arial" w:hAnsi="Arial"/>
-          <w:b w:val="0"/>
-          <w:bCs w:val="0"/>
-          <w:i w:val="0"/>
-          <w:iCs w:val="0"/>
-          <w:smallCaps w:val="0"/>
-          <w:strike w:val="0"/>
-          <w:color w:val="000000"/>
-          <w:sz w:val="19"/>
-          <w:szCs w:val="19"/>
-          <w:u w:val="none"/>
-          <w:shd w:fill="auto" w:val="clear"/>
-          <w:vertAlign w:val="baseline"/>
-          <w:rtl w:val="0"/>
-        </w:rPr>
-        <w:t xml:space="preserve">Demonstrated completed features to teammates and external stakeholders; proactively sought and incorporated feedback.</w:t>
-      </w:r>
-    </w:p>
-    <w:p>
-      <w:pPr>
-        <w:keepNext w:val="0"/>
-        <w:keepLines w:val="0"/>
-        <w:pageBreakBefore w:val="0"/>
-        <w:widowControl w:val="1"/>
-        <w:numPr>
-          <w:ilvl w:val="0"/>
-          <w:numId w:val="1"/>
-        </w:numPr>
-        <w:pBdr>
-          <w:top w:space="0" w:sz="0" w:val="nil"/>
-          <w:left w:space="0" w:sz="0" w:val="nil"/>
-          <w:bottom w:space="0" w:sz="0" w:val="nil"/>
-          <w:right w:space="0" w:sz="0" w:val="nil"/>
-          <w:between w:space="0" w:sz="0" w:val="nil"/>
-        </w:pBdr>
-        <w:shd w:fill="auto" w:val="clear"/>
-        <w:spacing w:after="30" w:before="0" w:line="276" w:lineRule="auto"/>
-        <w:ind w:left="259" w:right="0" w:hanging="173"/>
-        <w:jc w:val="left"/>
-        <w:rPr/>
-      </w:pPr>
-      <w:r>
-        <w:rPr>
-          <w:rFonts w:ascii="Arial" w:cs="Arial" w:eastAsia="Arial" w:hAnsi="Arial"/>
-          <w:b w:val="0"/>
-          <w:bCs w:val="0"/>
-          <w:i w:val="0"/>
-          <w:iCs w:val="0"/>
-          <w:smallCaps w:val="0"/>
-          <w:strike w:val="0"/>
-          <w:color w:val="000000"/>
-          <w:sz w:val="19"/>
-          <w:szCs w:val="19"/>
-          <w:u w:val="none"/>
-          <w:shd w:fill="auto" w:val="clear"/>
-          <w:vertAlign w:val="baseline"/>
-          <w:rtl w:val="0"/>
-        </w:rPr>
-        <w:t xml:space="preserve">Currently learning Go with the goal of making a meaningful open-source contribution impacting hundreds of developers.</w:t>
       </w:r>
     </w:p>
     <w:sectPr>
       <w:pgSz w:h="15840" w:w="12240" w:orient="portrait"/>
-      <w:pgMar w:bottom="792" w:top="792" w:left="936" w:right="936" w:header="720" w:footer="720"/>
+      <w:pgMar w:bottom="720" w:top="619" w:left="835" w:right="835" w:header="720" w:footer="720"/>
       <w:pgNumType w:start="1"/>
     </w:sectPr>
   </w:body>
@@ -1726,95 +1664,224 @@
       <w:lvlText w:val="●"/>
       <w:lvlJc w:val="left"/>
       <w:pPr>
-        <w:ind w:left="360" w:hanging="360"/>
+        <w:ind w:left="720" w:hanging="360"/>
       </w:pPr>
       <w:rPr>
-        <w:rFonts w:ascii="Noto Sans Symbols" w:cs="Noto Sans Symbols" w:eastAsia="Noto Sans Symbols" w:hAnsi="Noto Sans Symbols"/>
+        <w:u w:val="none"/>
       </w:rPr>
     </w:lvl>
     <w:lvl w:ilvl="1">
       <w:start w:val="1"/>
       <w:numFmt w:val="bullet"/>
-      <w:lvlText w:val=""/>
+      <w:lvlText w:val="○"/>
       <w:lvlJc w:val="left"/>
       <w:pPr>
-        <w:ind w:left="0" w:firstLine="0"/>
+        <w:ind w:left="1440" w:hanging="360"/>
       </w:pPr>
-      <w:rPr/>
+      <w:rPr>
+        <w:u w:val="none"/>
+      </w:rPr>
     </w:lvl>
     <w:lvl w:ilvl="2">
       <w:start w:val="1"/>
       <w:numFmt w:val="bullet"/>
-      <w:lvlText w:val=""/>
+      <w:lvlText w:val="■"/>
       <w:lvlJc w:val="left"/>
       <w:pPr>
-        <w:ind w:left="0" w:firstLine="0"/>
+        <w:ind w:left="2160" w:hanging="360"/>
       </w:pPr>
-      <w:rPr/>
+      <w:rPr>
+        <w:u w:val="none"/>
+      </w:rPr>
     </w:lvl>
     <w:lvl w:ilvl="3">
       <w:start w:val="1"/>
       <w:numFmt w:val="bullet"/>
-      <w:lvlText w:val=""/>
+      <w:lvlText w:val="●"/>
       <w:lvlJc w:val="left"/>
       <w:pPr>
-        <w:ind w:left="0" w:firstLine="0"/>
+        <w:ind w:left="2880" w:hanging="360"/>
       </w:pPr>
-      <w:rPr/>
+      <w:rPr>
+        <w:u w:val="none"/>
+      </w:rPr>
     </w:lvl>
     <w:lvl w:ilvl="4">
       <w:start w:val="1"/>
       <w:numFmt w:val="bullet"/>
-      <w:lvlText w:val=""/>
+      <w:lvlText w:val="○"/>
       <w:lvlJc w:val="left"/>
       <w:pPr>
-        <w:ind w:left="0" w:firstLine="0"/>
+        <w:ind w:left="3600" w:hanging="360"/>
       </w:pPr>
-      <w:rPr/>
+      <w:rPr>
+        <w:u w:val="none"/>
+      </w:rPr>
     </w:lvl>
     <w:lvl w:ilvl="5">
       <w:start w:val="1"/>
       <w:numFmt w:val="bullet"/>
-      <w:lvlText w:val=""/>
+      <w:lvlText w:val="■"/>
       <w:lvlJc w:val="left"/>
       <w:pPr>
-        <w:ind w:left="0" w:firstLine="0"/>
+        <w:ind w:left="4320" w:hanging="360"/>
       </w:pPr>
-      <w:rPr/>
+      <w:rPr>
+        <w:u w:val="none"/>
+      </w:rPr>
     </w:lvl>
     <w:lvl w:ilvl="6">
       <w:start w:val="1"/>
       <w:numFmt w:val="bullet"/>
-      <w:lvlText w:val=""/>
+      <w:lvlText w:val="●"/>
       <w:lvlJc w:val="left"/>
       <w:pPr>
-        <w:ind w:left="0" w:firstLine="0"/>
+        <w:ind w:left="5040" w:hanging="360"/>
       </w:pPr>
-      <w:rPr/>
+      <w:rPr>
+        <w:u w:val="none"/>
+      </w:rPr>
     </w:lvl>
     <w:lvl w:ilvl="7">
       <w:start w:val="1"/>
       <w:numFmt w:val="bullet"/>
-      <w:lvlText w:val=""/>
+      <w:lvlText w:val="○"/>
       <w:lvlJc w:val="left"/>
       <w:pPr>
-        <w:ind w:left="0" w:firstLine="0"/>
+        <w:ind w:left="5760" w:hanging="360"/>
       </w:pPr>
-      <w:rPr/>
+      <w:rPr>
+        <w:u w:val="none"/>
+      </w:rPr>
     </w:lvl>
     <w:lvl w:ilvl="8">
       <w:start w:val="1"/>
       <w:numFmt w:val="bullet"/>
-      <w:lvlText w:val=""/>
+      <w:lvlText w:val="■"/>
       <w:lvlJc w:val="left"/>
       <w:pPr>
-        <w:ind w:left="0" w:firstLine="0"/>
+        <w:ind w:left="6480" w:hanging="360"/>
       </w:pPr>
-      <w:rPr/>
+      <w:rPr>
+        <w:u w:val="none"/>
+      </w:rPr>
+    </w:lvl>
+  </w:abstractNum>
+  <w:abstractNum w:abstractNumId="2">
+    <w:lvl w:ilvl="0">
+      <w:start w:val="1"/>
+      <w:numFmt w:val="bullet"/>
+      <w:lvlText w:val="●"/>
+      <w:lvlJc w:val="left"/>
+      <w:pPr>
+        <w:ind w:left="720" w:hanging="360"/>
+      </w:pPr>
+      <w:rPr>
+        <w:u w:val="none"/>
+      </w:rPr>
+    </w:lvl>
+    <w:lvl w:ilvl="1">
+      <w:start w:val="1"/>
+      <w:numFmt w:val="bullet"/>
+      <w:lvlText w:val="○"/>
+      <w:lvlJc w:val="left"/>
+      <w:pPr>
+        <w:ind w:left="1440" w:hanging="360"/>
+      </w:pPr>
+      <w:rPr>
+        <w:u w:val="none"/>
+      </w:rPr>
+    </w:lvl>
+    <w:lvl w:ilvl="2">
+      <w:start w:val="1"/>
+      <w:numFmt w:val="bullet"/>
+      <w:lvlText w:val="■"/>
+      <w:lvlJc w:val="left"/>
+      <w:pPr>
+        <w:ind w:left="2160" w:hanging="360"/>
+      </w:pPr>
+      <w:rPr>
+        <w:u w:val="none"/>
+      </w:rPr>
+    </w:lvl>
+    <w:lvl w:ilvl="3">
+      <w:start w:val="1"/>
+      <w:numFmt w:val="bullet"/>
+      <w:lvlText w:val="●"/>
+      <w:lvlJc w:val="left"/>
+      <w:pPr>
+        <w:ind w:left="2880" w:hanging="360"/>
+      </w:pPr>
+      <w:rPr>
+        <w:u w:val="none"/>
+      </w:rPr>
+    </w:lvl>
+    <w:lvl w:ilvl="4">
+      <w:start w:val="1"/>
+      <w:numFmt w:val="bullet"/>
+      <w:lvlText w:val="○"/>
+      <w:lvlJc w:val="left"/>
+      <w:pPr>
+        <w:ind w:left="3600" w:hanging="360"/>
+      </w:pPr>
+      <w:rPr>
+        <w:u w:val="none"/>
+      </w:rPr>
+    </w:lvl>
+    <w:lvl w:ilvl="5">
+      <w:start w:val="1"/>
+      <w:numFmt w:val="bullet"/>
+      <w:lvlText w:val="■"/>
+      <w:lvlJc w:val="left"/>
+      <w:pPr>
+        <w:ind w:left="4320" w:hanging="360"/>
+      </w:pPr>
+      <w:rPr>
+        <w:u w:val="none"/>
+      </w:rPr>
+    </w:lvl>
+    <w:lvl w:ilvl="6">
+      <w:start w:val="1"/>
+      <w:numFmt w:val="bullet"/>
+      <w:lvlText w:val="●"/>
+      <w:lvlJc w:val="left"/>
+      <w:pPr>
+        <w:ind w:left="5040" w:hanging="360"/>
+      </w:pPr>
+      <w:rPr>
+        <w:u w:val="none"/>
+      </w:rPr>
+    </w:lvl>
+    <w:lvl w:ilvl="7">
+      <w:start w:val="1"/>
+      <w:numFmt w:val="bullet"/>
+      <w:lvlText w:val="○"/>
+      <w:lvlJc w:val="left"/>
+      <w:pPr>
+        <w:ind w:left="5760" w:hanging="360"/>
+      </w:pPr>
+      <w:rPr>
+        <w:u w:val="none"/>
+      </w:rPr>
+    </w:lvl>
+    <w:lvl w:ilvl="8">
+      <w:start w:val="1"/>
+      <w:numFmt w:val="bullet"/>
+      <w:lvlText w:val="■"/>
+      <w:lvlJc w:val="left"/>
+      <w:pPr>
+        <w:ind w:left="6480" w:hanging="360"/>
+      </w:pPr>
+      <w:rPr>
+        <w:u w:val="none"/>
+      </w:rPr>
     </w:lvl>
   </w:abstractNum>
   <w:num w:numId="1">
     <w:abstractNumId w:val="1"/>
+  </w:num>
+  <w:num w:numId="2">
+    <w:abstractNumId w:val="2"/>
   </w:num>
 </w:numbering>
 </file>
@@ -1825,8 +1892,8 @@
     <w:rPrDefault>
       <w:rPr>
         <w:rFonts w:ascii="Arial" w:cs="Arial" w:eastAsia="Arial" w:hAnsi="Arial"/>
-        <w:sz w:val="19"/>
-        <w:szCs w:val="19"/>
+        <w:sz w:val="18"/>
+        <w:szCs w:val="18"/>
         <w:lang w:val="en"/>
       </w:rPr>
     </w:rPrDefault>
@@ -1966,6 +2033,34 @@
       <w:sz w:val="52"/>
       <w:szCs w:val="52"/>
     </w:rPr>
+  </w:style>
+  <w:style w:type="table" w:styleId="TableNormal" w:default="1">
+    <w:name w:val="TableNormal"/>
+    <w:tblPr>
+      <w:tblCellMar>
+        <w:top w:w="100.0" w:type="dxa"/>
+        <w:left w:w="100.0" w:type="dxa"/>
+        <w:bottom w:w="100.0" w:type="dxa"/>
+        <w:right w:w="100.0" w:type="dxa"/>
+      </w:tblCellMar>
+    </w:tblPr>
+  </w:style>
+  <w:style w:type="paragraph" w:styleId="Normal" w:default="1">
+    <w:name w:val="normal"/>
+  </w:style>
+  <w:style w:type="table" w:styleId="TableNormal" w:default="1">
+    <w:name w:val="TableNormal"/>
+    <w:tblPr>
+      <w:tblCellMar>
+        <w:top w:w="100.0" w:type="dxa"/>
+        <w:left w:w="100.0" w:type="dxa"/>
+        <w:bottom w:w="100.0" w:type="dxa"/>
+        <w:right w:w="100.0" w:type="dxa"/>
+      </w:tblCellMar>
+    </w:tblPr>
+  </w:style>
+  <w:style w:type="paragraph" w:styleId="Normal" w:default="1">
+    <w:name w:val="normal"/>
   </w:style>
   <w:style w:type="paragraph" w:styleId="Header">
     <w:name w:val="header"/>
@@ -13803,7 +13898,7 @@
 
 <file path=customXML/item1.xml><?xml version="1.0" encoding="utf-8"?>
 <go:gDocsCustomXmlDataStorage xmlns:go="http://customooxmlschemas.google.com/" xmlns:r="http://schemas.openxmlformats.org/officeDocument/2006/relationships" uri="GoogleDocsCustomDataVersion2">
-  <go:docsCustomData xmlns:go="http://customooxmlschemas.google.com/" roundtripDataSignature="AMtx7mjPb2g9epXUwF9KsoPbUJAQakxsRw==">CgMxLjA4AHIhMUVSa3ZlYlFfZkp6ZWNCT0dRX05LYUM5dTg2OUZJRWtK</go:docsCustomData>
+  <go:docsCustomData xmlns:go="http://customooxmlschemas.google.com/" roundtripDataSignature="AMtx7mhI3Tj8FpVAL6/T6KjFO5xI3V9xXQ==">CgMxLjA4AHIhMVpTb3pHNkRDMlRMSlFMM3ZiM3R0cnlIWUpsTFRFUk9w</go:docsCustomData>
 </go:gDocsCustomXmlDataStorage>
 </file>
 

</xml_diff>